<commit_message>
docs: explain how to unblock downloaded Windows launchers
</commit_message>
<xml_diff>
--- a/Docs/User Guide/Master_Class_Diagnostics_Workbench_User_Guide.docx
+++ b/Docs/User Guide/Master_Class_Diagnostics_Workbench_User_Guide.docx
@@ -808,7 +808,7 @@
                 <w:bCs/>
                 <w:color w:val="0B1640"/>
               </w:rPr>
-              <w:t>1.0</w:t>
+              <w:t>1.1</w:t>
             </w:r>
           </w:p>
         </w:tc>
@@ -843,6 +843,82 @@
             <w:pPr>
               <w:spacing w:before="0" w:after="0"/>
               <w:cnfStyle w:val="000000100000" w:firstRow="0" w:lastRow="0" w:firstColumn="0" w:lastColumn="0" w:oddVBand="0" w:evenVBand="0" w:oddHBand="1" w:evenHBand="0" w:firstRowFirstColumn="0" w:firstRowLastColumn="0" w:lastRowFirstColumn="0" w:lastRowLastColumn="0"/>
+              <w:rPr>
+                <w:bCs/>
+                <w:color w:val="0B1640"/>
+              </w:rPr>
+            </w:pPr>
+            <w:r>
+              <w:rPr>
+                <w:bCs/>
+                <w:color w:val="0B1640"/>
+              </w:rPr>
+              <w:t>Added Windows launcher Unblock steps and a file Properties screenshot.</w:t>
+            </w:r>
+          </w:p>
+        </w:tc>
+      </w:tr>
+      <w:tr>
+        <w:tblPrEx>
+          <w:jc w:val="left"/>
+        </w:tblPrEx>
+        <w:trPr>
+          <w:cnfStyle w:val="000000010000" w:firstRow="0" w:lastRow="0" w:firstColumn="0" w:lastColumn="0" w:oddVBand="0" w:evenVBand="0" w:oddHBand="0" w:evenHBand="1" w:firstRowFirstColumn="0" w:firstRowLastColumn="0" w:lastRowFirstColumn="0" w:lastRowLastColumn="0"/>
+        </w:trPr>
+        <w:tc>
+          <w:tcPr>
+            <w:cnfStyle w:val="001000000000" w:firstRow="0" w:lastRow="0" w:firstColumn="1" w:lastColumn="0" w:oddVBand="0" w:evenVBand="0" w:oddHBand="0" w:evenHBand="0" w:firstRowFirstColumn="0" w:firstRowLastColumn="0" w:lastRowFirstColumn="0" w:lastRowLastColumn="0"/>
+            <w:tcW w:w="1500" w:type="dxa"/>
+          </w:tcPr>
+          <w:p>
+            <w:pPr>
+              <w:spacing w:before="0" w:after="0"/>
+              <w:jc w:val="center"/>
+              <w:rPr>
+                <w:bCs/>
+                <w:color w:val="0B1640"/>
+              </w:rPr>
+            </w:pPr>
+            <w:r>
+              <w:rPr>
+                <w:bCs/>
+                <w:color w:val="0B1640"/>
+              </w:rPr>
+              <w:t>1.0</w:t>
+            </w:r>
+          </w:p>
+        </w:tc>
+        <w:tc>
+          <w:tcPr>
+            <w:tcW w:w="1900" w:type="dxa"/>
+          </w:tcPr>
+          <w:p>
+            <w:pPr>
+              <w:spacing w:before="0" w:after="0"/>
+              <w:jc w:val="center"/>
+              <w:cnfStyle w:val="000000010000" w:firstRow="0" w:lastRow="0" w:firstColumn="0" w:lastColumn="0" w:oddVBand="0" w:evenVBand="0" w:oddHBand="0" w:evenHBand="1" w:firstRowFirstColumn="0" w:firstRowLastColumn="0" w:lastRowFirstColumn="0" w:lastRowLastColumn="0"/>
+              <w:rPr>
+                <w:bCs/>
+                <w:color w:val="0B1640"/>
+              </w:rPr>
+            </w:pPr>
+            <w:r>
+              <w:rPr>
+                <w:bCs/>
+                <w:color w:val="0B1640"/>
+              </w:rPr>
+              <w:t>10-14-2026</w:t>
+            </w:r>
+          </w:p>
+        </w:tc>
+        <w:tc>
+          <w:tcPr>
+            <w:tcW w:w="7384" w:type="dxa"/>
+          </w:tcPr>
+          <w:p>
+            <w:pPr>
+              <w:spacing w:before="0" w:after="0"/>
+              <w:cnfStyle w:val="000000010000" w:firstRow="0" w:lastRow="0" w:firstColumn="0" w:lastColumn="0" w:oddVBand="0" w:evenVBand="0" w:oddHBand="0" w:evenHBand="1" w:firstRowFirstColumn="0" w:firstRowLastColumn="0" w:lastRowFirstColumn="0" w:lastRowLastColumn="0"/>
               <w:rPr>
                 <w:bCs/>
                 <w:color w:val="0B1640"/>
@@ -1041,7 +1117,7 @@
         </w:rPr>
         <w:fldChar w:fldCharType="separate"/>
       </w:r>
-      <w:hyperlink w:anchor="_Toc242854229" w:history="1">
+      <w:hyperlink w:anchor="_Toc242892774" w:history="1">
         <w:r>
           <w:rPr>
             <w:rStyle w:val="Hyperlink"/>
@@ -1064,7 +1140,7 @@
           <w:rPr>
             <w:webHidden/>
           </w:rPr>
-          <w:instrText xml:space="preserve"> PAGEREF _Toc242854229 \h </w:instrText>
+          <w:instrText xml:space="preserve"> PAGEREF _Toc242892774 \h </w:instrText>
         </w:r>
         <w:r>
           <w:rPr>
@@ -1102,7 +1178,7 @@
           <w:szCs w:val="22"/>
         </w:rPr>
       </w:pPr>
-      <w:hyperlink w:anchor="_Toc242854230" w:history="1">
+      <w:hyperlink w:anchor="_Toc242892775" w:history="1">
         <w:r>
           <w:rPr>
             <w:rStyle w:val="Hyperlink"/>
@@ -1125,7 +1201,7 @@
           <w:rPr>
             <w:webHidden/>
           </w:rPr>
-          <w:instrText xml:space="preserve"> PAGEREF _Toc242854230 \h </w:instrText>
+          <w:instrText xml:space="preserve"> PAGEREF _Toc242892775 \h </w:instrText>
         </w:r>
         <w:r>
           <w:rPr>
@@ -1163,7 +1239,7 @@
           <w:szCs w:val="22"/>
         </w:rPr>
       </w:pPr>
-      <w:hyperlink w:anchor="_Toc242854231" w:history="1">
+      <w:hyperlink w:anchor="_Toc242892776" w:history="1">
         <w:r>
           <w:rPr>
             <w:rStyle w:val="Hyperlink"/>
@@ -1186,7 +1262,7 @@
           <w:rPr>
             <w:webHidden/>
           </w:rPr>
-          <w:instrText xml:space="preserve"> PAGEREF _Toc242854231 \h </w:instrText>
+          <w:instrText xml:space="preserve"> PAGEREF _Toc242892776 \h </w:instrText>
         </w:r>
         <w:r>
           <w:rPr>
@@ -1225,7 +1301,7 @@
           <w:szCs w:val="22"/>
         </w:rPr>
       </w:pPr>
-      <w:hyperlink w:anchor="_Toc242854232" w:history="1">
+      <w:hyperlink w:anchor="_Toc242892777" w:history="1">
         <w:r>
           <w:rPr>
             <w:rStyle w:val="Hyperlink"/>
@@ -1248,7 +1324,7 @@
           <w:rPr>
             <w:webHidden/>
           </w:rPr>
-          <w:instrText xml:space="preserve"> PAGEREF _Toc242854232 \h </w:instrText>
+          <w:instrText xml:space="preserve"> PAGEREF _Toc242892777 \h </w:instrText>
         </w:r>
         <w:r>
           <w:rPr>
@@ -1286,7 +1362,7 @@
           <w:szCs w:val="22"/>
         </w:rPr>
       </w:pPr>
-      <w:hyperlink w:anchor="_Toc242854233" w:history="1">
+      <w:hyperlink w:anchor="_Toc242892778" w:history="1">
         <w:r>
           <w:rPr>
             <w:rStyle w:val="Hyperlink"/>
@@ -1309,7 +1385,7 @@
           <w:rPr>
             <w:webHidden/>
           </w:rPr>
-          <w:instrText xml:space="preserve"> PAGEREF _Toc242854233 \h </w:instrText>
+          <w:instrText xml:space="preserve"> PAGEREF _Toc242892778 \h </w:instrText>
         </w:r>
         <w:r>
           <w:rPr>
@@ -1347,7 +1423,7 @@
           <w:szCs w:val="22"/>
         </w:rPr>
       </w:pPr>
-      <w:hyperlink w:anchor="_Toc242854234" w:history="1">
+      <w:hyperlink w:anchor="_Toc242892779" w:history="1">
         <w:r>
           <w:rPr>
             <w:rStyle w:val="Hyperlink"/>
@@ -1370,7 +1446,7 @@
           <w:rPr>
             <w:webHidden/>
           </w:rPr>
-          <w:instrText xml:space="preserve"> PAGEREF _Toc242854234 \h </w:instrText>
+          <w:instrText xml:space="preserve"> PAGEREF _Toc242892779 \h </w:instrText>
         </w:r>
         <w:r>
           <w:rPr>
@@ -1408,7 +1484,7 @@
           <w:szCs w:val="22"/>
         </w:rPr>
       </w:pPr>
-      <w:hyperlink w:anchor="_Toc242854235" w:history="1">
+      <w:hyperlink w:anchor="_Toc242892780" w:history="1">
         <w:r>
           <w:rPr>
             <w:rStyle w:val="Hyperlink"/>
@@ -1431,7 +1507,7 @@
           <w:rPr>
             <w:webHidden/>
           </w:rPr>
-          <w:instrText xml:space="preserve"> PAGEREF _Toc242854235 \h </w:instrText>
+          <w:instrText xml:space="preserve"> PAGEREF _Toc242892780 \h </w:instrText>
         </w:r>
         <w:r>
           <w:rPr>
@@ -1469,7 +1545,7 @@
           <w:szCs w:val="22"/>
         </w:rPr>
       </w:pPr>
-      <w:hyperlink w:anchor="_Toc242854236" w:history="1">
+      <w:hyperlink w:anchor="_Toc242892781" w:history="1">
         <w:r>
           <w:rPr>
             <w:rStyle w:val="Hyperlink"/>
@@ -1492,7 +1568,7 @@
           <w:rPr>
             <w:webHidden/>
           </w:rPr>
-          <w:instrText xml:space="preserve"> PAGEREF _Toc242854236 \h </w:instrText>
+          <w:instrText xml:space="preserve"> PAGEREF _Toc242892781 \h </w:instrText>
         </w:r>
         <w:r>
           <w:rPr>
@@ -1509,7 +1585,7 @@
           <w:rPr>
             <w:webHidden/>
           </w:rPr>
-          <w:t>6</w:t>
+          <w:t>7</w:t>
         </w:r>
         <w:r>
           <w:rPr>
@@ -1530,7 +1606,7 @@
           <w:szCs w:val="22"/>
         </w:rPr>
       </w:pPr>
-      <w:hyperlink w:anchor="_Toc242854237" w:history="1">
+      <w:hyperlink w:anchor="_Toc242892782" w:history="1">
         <w:r>
           <w:rPr>
             <w:rStyle w:val="Hyperlink"/>
@@ -1553,7 +1629,7 @@
           <w:rPr>
             <w:webHidden/>
           </w:rPr>
-          <w:instrText xml:space="preserve"> PAGEREF _Toc242854237 \h </w:instrText>
+          <w:instrText xml:space="preserve"> PAGEREF _Toc242892782 \h </w:instrText>
         </w:r>
         <w:r>
           <w:rPr>
@@ -1570,7 +1646,7 @@
           <w:rPr>
             <w:webHidden/>
           </w:rPr>
-          <w:t>6</w:t>
+          <w:t>7</w:t>
         </w:r>
         <w:r>
           <w:rPr>
@@ -1592,7 +1668,7 @@
           <w:szCs w:val="22"/>
         </w:rPr>
       </w:pPr>
-      <w:hyperlink w:anchor="_Toc242854238" w:history="1">
+      <w:hyperlink w:anchor="_Toc242892783" w:history="1">
         <w:r>
           <w:rPr>
             <w:rStyle w:val="Hyperlink"/>
@@ -1615,7 +1691,7 @@
           <w:rPr>
             <w:webHidden/>
           </w:rPr>
-          <w:instrText xml:space="preserve"> PAGEREF _Toc242854238 \h </w:instrText>
+          <w:instrText xml:space="preserve"> PAGEREF _Toc242892783 \h </w:instrText>
         </w:r>
         <w:r>
           <w:rPr>
@@ -1632,7 +1708,7 @@
           <w:rPr>
             <w:webHidden/>
           </w:rPr>
-          <w:t>7</w:t>
+          <w:t>8</w:t>
         </w:r>
         <w:r>
           <w:rPr>
@@ -1654,7 +1730,7 @@
           <w:szCs w:val="22"/>
         </w:rPr>
       </w:pPr>
-      <w:hyperlink w:anchor="_Toc242854239" w:history="1">
+      <w:hyperlink w:anchor="_Toc242892784" w:history="1">
         <w:r>
           <w:rPr>
             <w:rStyle w:val="Hyperlink"/>
@@ -1677,7 +1753,7 @@
           <w:rPr>
             <w:webHidden/>
           </w:rPr>
-          <w:instrText xml:space="preserve"> PAGEREF _Toc242854239 \h </w:instrText>
+          <w:instrText xml:space="preserve"> PAGEREF _Toc242892784 \h </w:instrText>
         </w:r>
         <w:r>
           <w:rPr>
@@ -1694,7 +1770,7 @@
           <w:rPr>
             <w:webHidden/>
           </w:rPr>
-          <w:t>8</w:t>
+          <w:t>9</w:t>
         </w:r>
         <w:r>
           <w:rPr>
@@ -1716,7 +1792,7 @@
           <w:szCs w:val="22"/>
         </w:rPr>
       </w:pPr>
-      <w:hyperlink w:anchor="_Toc242854240" w:history="1">
+      <w:hyperlink w:anchor="_Toc242892785" w:history="1">
         <w:r>
           <w:rPr>
             <w:rStyle w:val="Hyperlink"/>
@@ -1739,7 +1815,7 @@
           <w:rPr>
             <w:webHidden/>
           </w:rPr>
-          <w:instrText xml:space="preserve"> PAGEREF _Toc242854240 \h </w:instrText>
+          <w:instrText xml:space="preserve"> PAGEREF _Toc242892785 \h </w:instrText>
         </w:r>
         <w:r>
           <w:rPr>
@@ -1756,7 +1832,7 @@
           <w:rPr>
             <w:webHidden/>
           </w:rPr>
-          <w:t>9</w:t>
+          <w:t>10</w:t>
         </w:r>
         <w:r>
           <w:rPr>
@@ -1777,7 +1853,7 @@
           <w:szCs w:val="22"/>
         </w:rPr>
       </w:pPr>
-      <w:hyperlink w:anchor="_Toc242854241" w:history="1">
+      <w:hyperlink w:anchor="_Toc242892786" w:history="1">
         <w:r>
           <w:rPr>
             <w:rStyle w:val="Hyperlink"/>
@@ -1800,7 +1876,7 @@
           <w:rPr>
             <w:webHidden/>
           </w:rPr>
-          <w:instrText xml:space="preserve"> PAGEREF _Toc242854241 \h </w:instrText>
+          <w:instrText xml:space="preserve"> PAGEREF _Toc242892786 \h </w:instrText>
         </w:r>
         <w:r>
           <w:rPr>
@@ -1817,7 +1893,7 @@
           <w:rPr>
             <w:webHidden/>
           </w:rPr>
-          <w:t>9</w:t>
+          <w:t>10</w:t>
         </w:r>
         <w:r>
           <w:rPr>
@@ -1838,7 +1914,7 @@
           <w:szCs w:val="22"/>
         </w:rPr>
       </w:pPr>
-      <w:hyperlink w:anchor="_Toc242854242" w:history="1">
+      <w:hyperlink w:anchor="_Toc242892787" w:history="1">
         <w:r>
           <w:rPr>
             <w:rStyle w:val="Hyperlink"/>
@@ -1861,7 +1937,7 @@
           <w:rPr>
             <w:webHidden/>
           </w:rPr>
-          <w:instrText xml:space="preserve"> PAGEREF _Toc242854242 \h </w:instrText>
+          <w:instrText xml:space="preserve"> PAGEREF _Toc242892787 \h </w:instrText>
         </w:r>
         <w:r>
           <w:rPr>
@@ -1878,7 +1954,7 @@
           <w:rPr>
             <w:webHidden/>
           </w:rPr>
-          <w:t>10</w:t>
+          <w:t>11</w:t>
         </w:r>
         <w:r>
           <w:rPr>
@@ -1899,7 +1975,7 @@
           <w:szCs w:val="22"/>
         </w:rPr>
       </w:pPr>
-      <w:hyperlink w:anchor="_Toc242854243" w:history="1">
+      <w:hyperlink w:anchor="_Toc242892788" w:history="1">
         <w:r>
           <w:rPr>
             <w:rStyle w:val="Hyperlink"/>
@@ -1922,7 +1998,7 @@
           <w:rPr>
             <w:webHidden/>
           </w:rPr>
-          <w:instrText xml:space="preserve"> PAGEREF _Toc242854243 \h </w:instrText>
+          <w:instrText xml:space="preserve"> PAGEREF _Toc242892788 \h </w:instrText>
         </w:r>
         <w:r>
           <w:rPr>
@@ -1939,7 +2015,7 @@
           <w:rPr>
             <w:webHidden/>
           </w:rPr>
-          <w:t>10</w:t>
+          <w:t>11</w:t>
         </w:r>
         <w:r>
           <w:rPr>
@@ -1960,7 +2036,7 @@
           <w:szCs w:val="22"/>
         </w:rPr>
       </w:pPr>
-      <w:hyperlink w:anchor="_Toc242854244" w:history="1">
+      <w:hyperlink w:anchor="_Toc242892789" w:history="1">
         <w:r>
           <w:rPr>
             <w:rStyle w:val="Hyperlink"/>
@@ -1983,7 +2059,7 @@
           <w:rPr>
             <w:webHidden/>
           </w:rPr>
-          <w:instrText xml:space="preserve"> PAGEREF _Toc242854244 \h </w:instrText>
+          <w:instrText xml:space="preserve"> PAGEREF _Toc242892789 \h </w:instrText>
         </w:r>
         <w:r>
           <w:rPr>
@@ -2000,7 +2076,7 @@
           <w:rPr>
             <w:webHidden/>
           </w:rPr>
-          <w:t>11</w:t>
+          <w:t>12</w:t>
         </w:r>
         <w:r>
           <w:rPr>
@@ -2021,7 +2097,7 @@
           <w:szCs w:val="22"/>
         </w:rPr>
       </w:pPr>
-      <w:hyperlink w:anchor="_Toc242854245" w:history="1">
+      <w:hyperlink w:anchor="_Toc242892790" w:history="1">
         <w:r>
           <w:rPr>
             <w:rStyle w:val="Hyperlink"/>
@@ -2044,7 +2120,7 @@
           <w:rPr>
             <w:webHidden/>
           </w:rPr>
-          <w:instrText xml:space="preserve"> PAGEREF _Toc242854245 \h </w:instrText>
+          <w:instrText xml:space="preserve"> PAGEREF _Toc242892790 \h </w:instrText>
         </w:r>
         <w:r>
           <w:rPr>
@@ -2061,7 +2137,7 @@
           <w:rPr>
             <w:webHidden/>
           </w:rPr>
-          <w:t>12</w:t>
+          <w:t>13</w:t>
         </w:r>
         <w:r>
           <w:rPr>
@@ -2083,7 +2159,7 @@
           <w:szCs w:val="22"/>
         </w:rPr>
       </w:pPr>
-      <w:hyperlink w:anchor="_Toc242854246" w:history="1">
+      <w:hyperlink w:anchor="_Toc242892791" w:history="1">
         <w:r>
           <w:rPr>
             <w:rStyle w:val="Hyperlink"/>
@@ -2106,7 +2182,7 @@
           <w:rPr>
             <w:webHidden/>
           </w:rPr>
-          <w:instrText xml:space="preserve"> PAGEREF _Toc242854246 \h </w:instrText>
+          <w:instrText xml:space="preserve"> PAGEREF _Toc242892791 \h </w:instrText>
         </w:r>
         <w:r>
           <w:rPr>
@@ -2123,7 +2199,7 @@
           <w:rPr>
             <w:webHidden/>
           </w:rPr>
-          <w:t>13</w:t>
+          <w:t>14</w:t>
         </w:r>
         <w:r>
           <w:rPr>
@@ -2144,7 +2220,7 @@
           <w:szCs w:val="22"/>
         </w:rPr>
       </w:pPr>
-      <w:hyperlink w:anchor="_Toc242854247" w:history="1">
+      <w:hyperlink w:anchor="_Toc242892792" w:history="1">
         <w:r>
           <w:rPr>
             <w:rStyle w:val="Hyperlink"/>
@@ -2167,7 +2243,7 @@
           <w:rPr>
             <w:webHidden/>
           </w:rPr>
-          <w:instrText xml:space="preserve"> PAGEREF _Toc242854247 \h </w:instrText>
+          <w:instrText xml:space="preserve"> PAGEREF _Toc242892792 \h </w:instrText>
         </w:r>
         <w:r>
           <w:rPr>
@@ -2184,7 +2260,7 @@
           <w:rPr>
             <w:webHidden/>
           </w:rPr>
-          <w:t>14</w:t>
+          <w:t>15</w:t>
         </w:r>
         <w:r>
           <w:rPr>
@@ -2205,7 +2281,7 @@
           <w:szCs w:val="22"/>
         </w:rPr>
       </w:pPr>
-      <w:hyperlink w:anchor="_Toc242854248" w:history="1">
+      <w:hyperlink w:anchor="_Toc242892793" w:history="1">
         <w:r>
           <w:rPr>
             <w:rStyle w:val="Hyperlink"/>
@@ -2228,7 +2304,7 @@
           <w:rPr>
             <w:webHidden/>
           </w:rPr>
-          <w:instrText xml:space="preserve"> PAGEREF _Toc242854248 \h </w:instrText>
+          <w:instrText xml:space="preserve"> PAGEREF _Toc242892793 \h </w:instrText>
         </w:r>
         <w:r>
           <w:rPr>
@@ -2245,7 +2321,7 @@
           <w:rPr>
             <w:webHidden/>
           </w:rPr>
-          <w:t>14</w:t>
+          <w:t>15</w:t>
         </w:r>
         <w:r>
           <w:rPr>
@@ -2267,7 +2343,7 @@
           <w:szCs w:val="22"/>
         </w:rPr>
       </w:pPr>
-      <w:hyperlink w:anchor="_Toc242854249" w:history="1">
+      <w:hyperlink w:anchor="_Toc242892794" w:history="1">
         <w:r>
           <w:rPr>
             <w:rStyle w:val="Hyperlink"/>
@@ -2290,7 +2366,7 @@
           <w:rPr>
             <w:webHidden/>
           </w:rPr>
-          <w:instrText xml:space="preserve"> PAGEREF _Toc242854249 \h </w:instrText>
+          <w:instrText xml:space="preserve"> PAGEREF _Toc242892794 \h </w:instrText>
         </w:r>
         <w:r>
           <w:rPr>
@@ -2307,7 +2383,7 @@
           <w:rPr>
             <w:webHidden/>
           </w:rPr>
-          <w:t>15</w:t>
+          <w:t>16</w:t>
         </w:r>
         <w:r>
           <w:rPr>
@@ -2329,7 +2405,7 @@
           <w:szCs w:val="22"/>
         </w:rPr>
       </w:pPr>
-      <w:hyperlink w:anchor="_Toc242854250" w:history="1">
+      <w:hyperlink w:anchor="_Toc242892795" w:history="1">
         <w:r>
           <w:rPr>
             <w:rStyle w:val="Hyperlink"/>
@@ -2352,7 +2428,7 @@
           <w:rPr>
             <w:webHidden/>
           </w:rPr>
-          <w:instrText xml:space="preserve"> PAGEREF _Toc242854250 \h </w:instrText>
+          <w:instrText xml:space="preserve"> PAGEREF _Toc242892795 \h </w:instrText>
         </w:r>
         <w:r>
           <w:rPr>
@@ -2369,7 +2445,7 @@
           <w:rPr>
             <w:webHidden/>
           </w:rPr>
-          <w:t>16</w:t>
+          <w:t>17</w:t>
         </w:r>
         <w:r>
           <w:rPr>
@@ -2390,7 +2466,7 @@
           <w:szCs w:val="22"/>
         </w:rPr>
       </w:pPr>
-      <w:hyperlink w:anchor="_Toc242854251" w:history="1">
+      <w:hyperlink w:anchor="_Toc242892796" w:history="1">
         <w:r>
           <w:rPr>
             <w:rStyle w:val="Hyperlink"/>
@@ -2413,7 +2489,7 @@
           <w:rPr>
             <w:webHidden/>
           </w:rPr>
-          <w:instrText xml:space="preserve"> PAGEREF _Toc242854251 \h </w:instrText>
+          <w:instrText xml:space="preserve"> PAGEREF _Toc242892796 \h </w:instrText>
         </w:r>
         <w:r>
           <w:rPr>
@@ -2430,7 +2506,7 @@
           <w:rPr>
             <w:webHidden/>
           </w:rPr>
-          <w:t>16</w:t>
+          <w:t>17</w:t>
         </w:r>
         <w:r>
           <w:rPr>
@@ -2451,7 +2527,7 @@
           <w:szCs w:val="22"/>
         </w:rPr>
       </w:pPr>
-      <w:hyperlink w:anchor="_Toc242854252" w:history="1">
+      <w:hyperlink w:anchor="_Toc242892797" w:history="1">
         <w:r>
           <w:rPr>
             <w:rStyle w:val="Hyperlink"/>
@@ -2474,7 +2550,7 @@
           <w:rPr>
             <w:webHidden/>
           </w:rPr>
-          <w:instrText xml:space="preserve"> PAGEREF _Toc242854252 \h </w:instrText>
+          <w:instrText xml:space="preserve"> PAGEREF _Toc242892797 \h </w:instrText>
         </w:r>
         <w:r>
           <w:rPr>
@@ -2491,7 +2567,7 @@
           <w:rPr>
             <w:webHidden/>
           </w:rPr>
-          <w:t>16</w:t>
+          <w:t>17</w:t>
         </w:r>
         <w:r>
           <w:rPr>
@@ -2512,7 +2588,7 @@
           <w:szCs w:val="22"/>
         </w:rPr>
       </w:pPr>
-      <w:hyperlink w:anchor="_Toc242854253" w:history="1">
+      <w:hyperlink w:anchor="_Toc242892798" w:history="1">
         <w:r>
           <w:rPr>
             <w:rStyle w:val="Hyperlink"/>
@@ -2535,7 +2611,7 @@
           <w:rPr>
             <w:webHidden/>
           </w:rPr>
-          <w:instrText xml:space="preserve"> PAGEREF _Toc242854253 \h </w:instrText>
+          <w:instrText xml:space="preserve"> PAGEREF _Toc242892798 \h </w:instrText>
         </w:r>
         <w:r>
           <w:rPr>
@@ -2552,7 +2628,7 @@
           <w:rPr>
             <w:webHidden/>
           </w:rPr>
-          <w:t>16</w:t>
+          <w:t>17</w:t>
         </w:r>
         <w:r>
           <w:rPr>
@@ -2573,7 +2649,7 @@
           <w:szCs w:val="22"/>
         </w:rPr>
       </w:pPr>
-      <w:hyperlink w:anchor="_Toc242854254" w:history="1">
+      <w:hyperlink w:anchor="_Toc242892799" w:history="1">
         <w:r>
           <w:rPr>
             <w:rStyle w:val="Hyperlink"/>
@@ -2596,7 +2672,7 @@
           <w:rPr>
             <w:webHidden/>
           </w:rPr>
-          <w:instrText xml:space="preserve"> PAGEREF _Toc242854254 \h </w:instrText>
+          <w:instrText xml:space="preserve"> PAGEREF _Toc242892799 \h </w:instrText>
         </w:r>
         <w:r>
           <w:rPr>
@@ -2613,7 +2689,7 @@
           <w:rPr>
             <w:webHidden/>
           </w:rPr>
-          <w:t>16</w:t>
+          <w:t>17</w:t>
         </w:r>
         <w:r>
           <w:rPr>
@@ -2634,7 +2710,7 @@
           <w:szCs w:val="22"/>
         </w:rPr>
       </w:pPr>
-      <w:hyperlink w:anchor="_Toc242854255" w:history="1">
+      <w:hyperlink w:anchor="_Toc242892800" w:history="1">
         <w:r>
           <w:rPr>
             <w:rStyle w:val="Hyperlink"/>
@@ -2657,7 +2733,7 @@
           <w:rPr>
             <w:webHidden/>
           </w:rPr>
-          <w:instrText xml:space="preserve"> PAGEREF _Toc242854255 \h </w:instrText>
+          <w:instrText xml:space="preserve"> PAGEREF _Toc242892800 \h </w:instrText>
         </w:r>
         <w:r>
           <w:rPr>
@@ -2674,7 +2750,7 @@
           <w:rPr>
             <w:webHidden/>
           </w:rPr>
-          <w:t>16</w:t>
+          <w:t>17</w:t>
         </w:r>
         <w:r>
           <w:rPr>
@@ -2727,7 +2803,7 @@
         <w:ind w:left="720"/>
       </w:pPr>
       <w:bookmarkStart w:id="0" w:name="_Toc242853463"/>
-      <w:bookmarkStart w:id="1" w:name="_Toc242854229"/>
+      <w:bookmarkStart w:id="1" w:name="_Toc242892774"/>
       <w:r>
         <w:rPr>
           <w:noProof/>
@@ -3043,7 +3119,7 @@
         <w:pStyle w:val="Heading2"/>
       </w:pPr>
       <w:bookmarkStart w:id="2" w:name="_Toc242853464"/>
-      <w:bookmarkStart w:id="3" w:name="_Toc242854230"/>
+      <w:bookmarkStart w:id="3" w:name="_Toc242892775"/>
       <w:r>
         <w:t>1.1 Purpose And Project Status</w:t>
       </w:r>
@@ -3090,7 +3166,7 @@
       <w:pPr>
         <w:pStyle w:val="Heading2"/>
       </w:pPr>
-      <w:bookmarkStart w:id="4" w:name="_Toc242854231"/>
+      <w:bookmarkStart w:id="4" w:name="_Toc242892776"/>
       <w:bookmarkEnd w:id="2"/>
       <w:r>
         <w:t>1.2 Requirements</w:t>
@@ -3489,7 +3565,7 @@
         <w:ind w:left="720"/>
       </w:pPr>
       <w:bookmarkStart w:id="5" w:name="_Toc242853465"/>
-      <w:bookmarkStart w:id="6" w:name="_Toc242854232"/>
+      <w:bookmarkStart w:id="6" w:name="_Toc242892777"/>
       <w:r>
         <w:rPr>
           <w:noProof/>
@@ -3640,7 +3716,7 @@
         <w:pStyle w:val="Heading2"/>
       </w:pPr>
       <w:bookmarkStart w:id="7" w:name="_Toc242853466"/>
-      <w:bookmarkStart w:id="8" w:name="_Toc242854233"/>
+      <w:bookmarkStart w:id="8" w:name="_Toc242892778"/>
       <w:r>
         <w:t>2.1 Install Python</w:t>
       </w:r>
@@ -3757,7 +3833,7 @@
         <w:pStyle w:val="Heading2"/>
       </w:pPr>
       <w:bookmarkStart w:id="9" w:name="_Toc242853467"/>
-      <w:bookmarkStart w:id="10" w:name="_Toc242854234"/>
+      <w:bookmarkStart w:id="10" w:name="_Toc242892779"/>
       <w:r>
         <w:t>2.2 Install uv</w:t>
       </w:r>
@@ -3792,7 +3868,7 @@
         <w:pStyle w:val="Heading2"/>
       </w:pPr>
       <w:bookmarkStart w:id="11" w:name="_Toc242853468"/>
-      <w:bookmarkStart w:id="12" w:name="_Toc242854235"/>
+      <w:bookmarkStart w:id="12" w:name="_Toc242892780"/>
       <w:r>
         <w:t>2.3 Launch The Workbench</w:t>
       </w:r>
@@ -3812,6 +3888,95 @@
       </w:r>
       <w:r>
         <w:t xml:space="preserve"> from the application folder.</w:t>
+      </w:r>
+    </w:p>
+    <w:p>
+      <w:pPr>
+        <w:keepNext/>
+        <w:keepLines/>
+        <w:spacing w:before="0"/>
+        <w:rPr>
+          <w:b/>
+        </w:rPr>
+      </w:pPr>
+      <w:r>
+        <w:rPr>
+          <w:b/>
+        </w:rPr>
+        <w:lastRenderedPageBreak/>
+        <w:t>Unblock the Windows launcher</w:t>
+      </w:r>
+    </w:p>
+    <w:p>
+      <w:pPr>
+        <w:keepNext/>
+        <w:keepLines/>
+        <w:spacing w:before="0"/>
+      </w:pPr>
+      <w:r>
+        <w:t>Windows may block the .cmd launcher because it was downloaded from the Internet. If it will not run, right-click the .cmd file and select Properties. On the General tab, tick the Unblock box at the bottom, then click OK. Run the launcher again. If Unblock is not shown, no change is needed.</w:t>
+      </w:r>
+    </w:p>
+    <w:p>
+      <w:pPr>
+        <w:keepNext/>
+        <w:keepLines/>
+        <w:spacing w:before="0"/>
+        <w:jc w:val="center"/>
+      </w:pPr>
+      <w:r>
+        <w:rPr>
+          <w:noProof/>
+        </w:rPr>
+        <w:drawing>
+          <wp:inline distT="0" distB="0" distL="0" distR="0" wp14:anchorId="34C96BCE" wp14:editId="3C3557C6">
+            <wp:extent cx="2377440" cy="2981874"/>
+            <wp:effectExtent l="0" t="0" r="3810" b="9525"/>
+            <wp:docPr id="11" name="Picture 11" descr="Windows General tab in the launcher file Properties dialog. The Unblock checkbox is selected at the bottom next to the Internet download security message."/>
+            <wp:cNvGraphicFramePr>
+              <a:graphicFrameLocks xmlns:a="http://schemas.openxmlformats.org/drawingml/2006/main" noChangeAspect="1"/>
+            </wp:cNvGraphicFramePr>
+            <a:graphic xmlns:a="http://schemas.openxmlformats.org/drawingml/2006/main">
+              <a:graphicData uri="http://schemas.openxmlformats.org/drawingml/2006/picture">
+                <pic:pic xmlns:pic="http://schemas.openxmlformats.org/drawingml/2006/picture">
+                  <pic:nvPicPr>
+                    <pic:cNvPr id="11" name="Picture 11" descr="Windows General tab in the launcher file Properties dialog. The Unblock checkbox is selected at the bottom next to the Internet download security message."/>
+                    <pic:cNvPicPr/>
+                  </pic:nvPicPr>
+                  <pic:blipFill>
+                    <a:blip r:embed="rId16"/>
+                    <a:stretch>
+                      <a:fillRect/>
+                    </a:stretch>
+                  </pic:blipFill>
+                  <pic:spPr>
+                    <a:xfrm>
+                      <a:off x="0" y="0"/>
+                      <a:ext cx="2377440" cy="2981874"/>
+                    </a:xfrm>
+                    <a:prstGeom prst="rect">
+                      <a:avLst/>
+                    </a:prstGeom>
+                  </pic:spPr>
+                </pic:pic>
+              </a:graphicData>
+            </a:graphic>
+          </wp:inline>
+        </w:drawing>
+      </w:r>
+    </w:p>
+    <w:p>
+      <w:pPr>
+        <w:keepLines/>
+        <w:spacing w:before="0"/>
+        <w:jc w:val="center"/>
+      </w:pPr>
+      <w:r>
+        <w:rPr>
+          <w:i/>
+          <w:sz w:val="18"/>
+        </w:rPr>
+        <w:t>Example: Run Diagnostics Workbench.cmd properties with Unblock selected. The same steps apply to this tool's .cmd launcher.</w:t>
       </w:r>
     </w:p>
     <w:p>
@@ -3865,7 +4030,7 @@
                     <pic:cNvPicPr/>
                   </pic:nvPicPr>
                   <pic:blipFill>
-                    <a:blip r:embed="rId16"/>
+                    <a:blip r:embed="rId17"/>
                     <a:stretch>
                       <a:fillRect/>
                     </a:stretch>
@@ -4076,7 +4241,7 @@
         <w:pStyle w:val="Heading2"/>
       </w:pPr>
       <w:bookmarkStart w:id="13" w:name="_Toc242853469"/>
-      <w:bookmarkStart w:id="14" w:name="_Toc242854236"/>
+      <w:bookmarkStart w:id="14" w:name="_Toc242892781"/>
       <w:r>
         <w:lastRenderedPageBreak/>
         <w:t>2.4 If Setup Fails</w:t>
@@ -4283,7 +4448,7 @@
         <w:pStyle w:val="Heading2"/>
       </w:pPr>
       <w:bookmarkStart w:id="15" w:name="_Toc242853470"/>
-      <w:bookmarkStart w:id="16" w:name="_Toc242854237"/>
+      <w:bookmarkStart w:id="16" w:name="_Toc242892782"/>
       <w:r>
         <w:t>2.5 Collect The Data</w:t>
       </w:r>
@@ -4555,7 +4720,7 @@
         <w:ind w:left="720"/>
       </w:pPr>
       <w:bookmarkStart w:id="17" w:name="_Toc242853471"/>
-      <w:bookmarkStart w:id="18" w:name="_Toc242854238"/>
+      <w:bookmarkStart w:id="18" w:name="_Toc242892783"/>
       <w:r>
         <w:rPr>
           <w:noProof/>
@@ -4584,7 +4749,7 @@
                     <pic:cNvPicPr/>
                   </pic:nvPicPr>
                   <pic:blipFill>
-                    <a:blip r:embed="rId17"/>
+                    <a:blip r:embed="rId18"/>
                     <a:stretch>
                       <a:fillRect/>
                     </a:stretch>
@@ -4784,7 +4949,7 @@
                     <pic:cNvPicPr/>
                   </pic:nvPicPr>
                   <pic:blipFill>
-                    <a:blip r:embed="rId18"/>
+                    <a:blip r:embed="rId19"/>
                     <a:stretch>
                       <a:fillRect/>
                     </a:stretch>
@@ -4868,7 +5033,7 @@
         <w:ind w:left="720"/>
       </w:pPr>
       <w:bookmarkStart w:id="19" w:name="_Toc242853472"/>
-      <w:bookmarkStart w:id="20" w:name="_Toc242854239"/>
+      <w:bookmarkStart w:id="20" w:name="_Toc242892784"/>
       <w:r>
         <w:rPr>
           <w:noProof/>
@@ -4897,7 +5062,7 @@
                     <pic:cNvPicPr/>
                   </pic:nvPicPr>
                   <pic:blipFill>
-                    <a:blip r:embed="rId19"/>
+                    <a:blip r:embed="rId20"/>
                     <a:stretch>
                       <a:fillRect/>
                     </a:stretch>
@@ -5482,7 +5647,7 @@
                     <pic:cNvPicPr/>
                   </pic:nvPicPr>
                   <pic:blipFill>
-                    <a:blip r:embed="rId20"/>
+                    <a:blip r:embed="rId21"/>
                     <a:stretch>
                       <a:fillRect/>
                     </a:stretch>
@@ -5623,7 +5788,7 @@
         <w:ind w:left="720"/>
       </w:pPr>
       <w:bookmarkStart w:id="21" w:name="_Toc242853473"/>
-      <w:bookmarkStart w:id="22" w:name="_Toc242854240"/>
+      <w:bookmarkStart w:id="22" w:name="_Toc242892785"/>
       <w:r>
         <w:rPr>
           <w:noProof/>
@@ -5652,7 +5817,7 @@
                     <pic:cNvPicPr/>
                   </pic:nvPicPr>
                   <pic:blipFill>
-                    <a:blip r:embed="rId21"/>
+                    <a:blip r:embed="rId22"/>
                     <a:stretch>
                       <a:fillRect/>
                     </a:stretch>
@@ -5926,7 +6091,7 @@
         <w:pStyle w:val="Heading2"/>
       </w:pPr>
       <w:bookmarkStart w:id="23" w:name="_Toc242853474"/>
-      <w:bookmarkStart w:id="24" w:name="_Toc242854241"/>
+      <w:bookmarkStart w:id="24" w:name="_Toc242892786"/>
       <w:r>
         <w:t>5.1 Select Modules</w:t>
       </w:r>
@@ -6069,7 +6234,7 @@
                     <pic:cNvPicPr/>
                   </pic:nvPicPr>
                   <pic:blipFill>
-                    <a:blip r:embed="rId22"/>
+                    <a:blip r:embed="rId23"/>
                     <a:stretch>
                       <a:fillRect/>
                     </a:stretch>
@@ -6513,7 +6678,7 @@
         <w:pStyle w:val="Heading2"/>
       </w:pPr>
       <w:bookmarkStart w:id="25" w:name="_Toc242853475"/>
-      <w:bookmarkStart w:id="26" w:name="_Toc242854242"/>
+      <w:bookmarkStart w:id="26" w:name="_Toc242892787"/>
       <w:r>
         <w:t>5.2 Statuses</w:t>
       </w:r>
@@ -6905,7 +7070,7 @@
         <w:pStyle w:val="Heading2"/>
       </w:pPr>
       <w:bookmarkStart w:id="27" w:name="_Toc242853476"/>
-      <w:bookmarkStart w:id="28" w:name="_Toc242854243"/>
+      <w:bookmarkStart w:id="28" w:name="_Toc242892788"/>
       <w:r>
         <w:t>5.3 Client Performance Analysis</w:t>
       </w:r>
@@ -7173,7 +7338,7 @@
                     <pic:cNvPicPr/>
                   </pic:nvPicPr>
                   <pic:blipFill>
-                    <a:blip r:embed="rId23"/>
+                    <a:blip r:embed="rId24"/>
                     <a:stretch>
                       <a:fillRect/>
                     </a:stretch>
@@ -7281,7 +7446,7 @@
         <w:pStyle w:val="Heading2"/>
       </w:pPr>
       <w:bookmarkStart w:id="29" w:name="_Toc242853477"/>
-      <w:bookmarkStart w:id="30" w:name="_Toc242854244"/>
+      <w:bookmarkStart w:id="30" w:name="_Toc242892789"/>
       <w:r>
         <w:t>5.4 Perfmon Infrastructure Analysis</w:t>
       </w:r>
@@ -7784,7 +7949,7 @@
                     <pic:cNvPicPr/>
                   </pic:nvPicPr>
                   <pic:blipFill>
-                    <a:blip r:embed="rId24"/>
+                    <a:blip r:embed="rId25"/>
                     <a:stretch>
                       <a:fillRect/>
                     </a:stretch>
@@ -7971,7 +8136,7 @@
         <w:pStyle w:val="Heading2"/>
       </w:pPr>
       <w:bookmarkStart w:id="31" w:name="_Toc242853478"/>
-      <w:bookmarkStart w:id="32" w:name="_Toc242854245"/>
+      <w:bookmarkStart w:id="32" w:name="_Toc242892790"/>
       <w:r>
         <w:t>5.5 FillDB Performance Analysis</w:t>
       </w:r>
@@ -8231,7 +8396,7 @@
         <w:ind w:left="720"/>
       </w:pPr>
       <w:bookmarkStart w:id="33" w:name="_Toc242853479"/>
-      <w:bookmarkStart w:id="34" w:name="_Toc242854246"/>
+      <w:bookmarkStart w:id="34" w:name="_Toc242892791"/>
       <w:r>
         <w:rPr>
           <w:noProof/>
@@ -8260,7 +8425,7 @@
                     <pic:cNvPicPr/>
                   </pic:nvPicPr>
                   <pic:blipFill>
-                    <a:blip r:embed="rId25"/>
+                    <a:blip r:embed="rId26"/>
                     <a:stretch>
                       <a:fillRect/>
                     </a:stretch>
@@ -8665,7 +8830,7 @@
                     <pic:cNvPicPr/>
                   </pic:nvPicPr>
                   <pic:blipFill>
-                    <a:blip r:embed="rId26"/>
+                    <a:blip r:embed="rId27"/>
                     <a:stretch>
                       <a:fillRect/>
                     </a:stretch>
@@ -8788,7 +8953,7 @@
         <w:pStyle w:val="Heading2"/>
       </w:pPr>
       <w:bookmarkStart w:id="35" w:name="_Toc242853480"/>
-      <w:bookmarkStart w:id="36" w:name="_Toc242854247"/>
+      <w:bookmarkStart w:id="36" w:name="_Toc242892792"/>
       <w:r>
         <w:lastRenderedPageBreak/>
         <w:t>6.1 Output Terms</w:t>
@@ -9015,7 +9180,7 @@
         <w:pStyle w:val="Heading2"/>
       </w:pPr>
       <w:bookmarkStart w:id="37" w:name="_Toc242853481"/>
-      <w:bookmarkStart w:id="38" w:name="_Toc242854248"/>
+      <w:bookmarkStart w:id="38" w:name="_Toc242892793"/>
       <w:r>
         <w:t>6.2 The Run Folder</w:t>
       </w:r>
@@ -9357,7 +9522,7 @@
                     <pic:cNvPicPr/>
                   </pic:nvPicPr>
                   <pic:blipFill>
-                    <a:blip r:embed="rId27"/>
+                    <a:blip r:embed="rId28"/>
                     <a:stretch>
                       <a:fillRect/>
                     </a:stretch>
@@ -9498,7 +9663,7 @@
         <w:ind w:left="720"/>
       </w:pPr>
       <w:bookmarkStart w:id="39" w:name="_Toc242853482"/>
-      <w:bookmarkStart w:id="40" w:name="_Toc242854249"/>
+      <w:bookmarkStart w:id="40" w:name="_Toc242892794"/>
       <w:r>
         <w:rPr>
           <w:noProof/>
@@ -9527,7 +9692,7 @@
                     <pic:cNvPicPr/>
                   </pic:nvPicPr>
                   <pic:blipFill>
-                    <a:blip r:embed="rId28"/>
+                    <a:blip r:embed="rId29"/>
                     <a:stretch>
                       <a:fillRect/>
                     </a:stretch>
@@ -10153,7 +10318,7 @@
         <w:ind w:left="720"/>
       </w:pPr>
       <w:bookmarkStart w:id="41" w:name="_Toc242853483"/>
-      <w:bookmarkStart w:id="42" w:name="_Toc242854250"/>
+      <w:bookmarkStart w:id="42" w:name="_Toc242892795"/>
       <w:r>
         <w:rPr>
           <w:noProof/>
@@ -10182,7 +10347,7 @@
                     <pic:cNvPicPr/>
                   </pic:nvPicPr>
                   <pic:blipFill>
-                    <a:blip r:embed="rId29"/>
+                    <a:blip r:embed="rId30"/>
                     <a:stretch>
                       <a:fillRect/>
                     </a:stretch>
@@ -10299,7 +10464,7 @@
         <w:pStyle w:val="Heading2"/>
       </w:pPr>
       <w:bookmarkStart w:id="43" w:name="_Toc242853484"/>
-      <w:bookmarkStart w:id="44" w:name="_Toc242854251"/>
+      <w:bookmarkStart w:id="44" w:name="_Toc242892796"/>
       <w:r>
         <w:t>8.1 Air-Gapped Analysis</w:t>
       </w:r>
@@ -10316,7 +10481,7 @@
         <w:pStyle w:val="Heading2"/>
       </w:pPr>
       <w:bookmarkStart w:id="45" w:name="_Toc242853485"/>
-      <w:bookmarkStart w:id="46" w:name="_Toc242854252"/>
+      <w:bookmarkStart w:id="46" w:name="_Toc242892797"/>
       <w:r>
         <w:t>8.2 The Private Python Environment</w:t>
       </w:r>
@@ -10338,7 +10503,7 @@
         <w:pStyle w:val="Heading2"/>
       </w:pPr>
       <w:bookmarkStart w:id="47" w:name="_Toc242853486"/>
-      <w:bookmarkStart w:id="48" w:name="_Toc242854253"/>
+      <w:bookmarkStart w:id="48" w:name="_Toc242892798"/>
       <w:r>
         <w:t>8.3 Dependency Cooldowns</w:t>
       </w:r>
@@ -10355,7 +10520,7 @@
         <w:pStyle w:val="Heading2"/>
       </w:pPr>
       <w:bookmarkStart w:id="49" w:name="_Toc242853487"/>
-      <w:bookmarkStart w:id="50" w:name="_Toc242854254"/>
+      <w:bookmarkStart w:id="50" w:name="_Toc242892799"/>
       <w:r>
         <w:t>8.4 Code Sweeps</w:t>
       </w:r>
@@ -10377,7 +10542,7 @@
         <w:pStyle w:val="Heading2"/>
       </w:pPr>
       <w:bookmarkStart w:id="51" w:name="_Toc242853488"/>
-      <w:bookmarkStart w:id="52" w:name="_Toc242854255"/>
+      <w:bookmarkStart w:id="52" w:name="_Toc242892800"/>
       <w:r>
         <w:t>8.5 Data Handling Rules</w:t>
       </w:r>
@@ -10429,7 +10594,6 @@
       </w:r>
     </w:p>
     <w:sectPr>
-      <w:headerReference w:type="default" r:id="rId30"/>
       <w:footerReference w:type="default" r:id="rId31"/>
       <w:type w:val="continuous"/>
       <w:pgSz w:w="12240" w:h="15840"/>
@@ -10575,16 +10739,6 @@
     </w:p>
   </w:footnote>
 </w:footnotes>
-</file>
-
-<file path=word/header1.xml><?xml version="1.0" encoding="utf-8"?>
-<w:hdr xmlns:wpc="http://schemas.microsoft.com/office/word/2010/wordprocessingCanvas" xmlns:cx="http://schemas.microsoft.com/office/drawing/2014/chartex" xmlns:cx1="http://schemas.microsoft.com/office/drawing/2015/9/8/chartex" xmlns:cx2="http://schemas.microsoft.com/office/drawing/2015/10/21/chartex" xmlns:cx3="http://schemas.microsoft.com/office/drawing/2016/5/9/chartex" xmlns:cx4="http://schemas.microsoft.com/office/drawing/2016/5/10/chartex" xmlns:cx5="http://schemas.microsoft.com/office/drawing/2016/5/11/chartex" xmlns:cx6="http://schemas.microsoft.com/office/drawing/2016/5/12/chartex" xmlns:cx7="http://schemas.microsoft.com/office/drawing/2016/5/13/chartex" xmlns:cx8="http://schemas.microsoft.com/office/drawing/2016/5/14/chartex" xmlns:mc="http://schemas.openxmlformats.org/markup-compatibility/2006" xmlns:aink="http://schemas.microsoft.com/office/drawing/2016/ink" xmlns:am3d="http://schemas.microsoft.com/office/drawing/2017/model3d" xmlns:o="urn:schemas-microsoft-com:office:office" xmlns:oel="http://schemas.microsoft.com/office/2019/extlst" xmlns:r="http://schemas.openxmlformats.org/officeDocument/2006/relationships" xmlns:m="http://schemas.openxmlformats.org/officeDocument/2006/math" xmlns:v="urn:schemas-microsoft-com:vml" xmlns:wp14="http://schemas.microsoft.com/office/word/2010/wordprocessingDrawing" xmlns:wp="http://schemas.openxmlformats.org/drawingml/2006/wordprocessingDrawing" xmlns:w10="urn:schemas-microsoft-com:office:word" xmlns:w="http://schemas.openxmlformats.org/wordprocessingml/2006/main" xmlns:w14="http://schemas.microsoft.com/office/word/2010/wordml" xmlns:w15="http://schemas.microsoft.com/office/word/2012/wordml" xmlns:w16cex="http://schemas.microsoft.com/office/word/2018/wordml/cex" xmlns:w16cid="http://schemas.microsoft.com/office/word/2016/wordml/cid" xmlns:w16="http://schemas.microsoft.com/office/word/2018/wordml" xmlns:w16sdtdh="http://schemas.microsoft.com/office/word/2020/wordml/sdtdatahash" xmlns:w16se="http://schemas.microsoft.com/office/word/2015/wordml/symex" xmlns:wpg="http://schemas.microsoft.com/office/word/2010/wordprocessingGroup" xmlns:wpi="http://schemas.microsoft.com/office/word/2010/wordprocessingInk" xmlns:wne="http://schemas.microsoft.com/office/word/2006/wordml" xmlns:wps="http://schemas.microsoft.com/office/word/2010/wordprocessingShape" mc:Ignorable="w14 w15 w16se w16cid w16 w16cex w16sdtdh wp14">
-  <w:p>
-    <w:pPr>
-      <w:pStyle w:val="Header"/>
-    </w:pPr>
-  </w:p>
-</w:hdr>
 </file>
 
 <file path=word/numbering.xml><?xml version="1.0" encoding="utf-8"?>
@@ -15903,6 +16057,12 @@
 </file>
 
 <file path=customXml/item1.xml><?xml version="1.0" encoding="utf-8"?>
+<p:properties xmlns:p="http://schemas.microsoft.com/office/2006/metadata/properties" xmlns:xsi="http://www.w3.org/2001/XMLSchema-instance" xmlns:pc="http://schemas.microsoft.com/office/infopath/2007/PartnerControls">
+  <documentManagement/>
+</p:properties>
+</file>
+
+<file path=customXml/item2.xml><?xml version="1.0" encoding="utf-8"?>
 <?mso-contentType ?>
 <FormTemplates xmlns="http://schemas.microsoft.com/sharepoint/v3/contenttype/forms">
   <Display>DocumentLibraryForm</Display>
@@ -15911,17 +16071,7 @@
 </FormTemplates>
 </file>
 
-<file path=customXml/item2.xml><?xml version="1.0" encoding="utf-8"?>
-<p:properties xmlns:p="http://schemas.microsoft.com/office/2006/metadata/properties" xmlns:xsi="http://www.w3.org/2001/XMLSchema-instance" xmlns:pc="http://schemas.microsoft.com/office/infopath/2007/PartnerControls">
-  <documentManagement/>
-</p:properties>
-</file>
-
 <file path=customXml/item3.xml><?xml version="1.0" encoding="utf-8"?>
-<b:Sources xmlns:b="http://schemas.openxmlformats.org/officeDocument/2006/bibliography" xmlns="http://schemas.openxmlformats.org/officeDocument/2006/bibliography" SelectedStyle="/APA.XSL" StyleName="APA"/>
-</file>
-
-<file path=customXml/item4.xml><?xml version="1.0" encoding="utf-8"?>
 <ct:contentTypeSchema xmlns:ct="http://schemas.microsoft.com/office/2006/metadata/contentType" xmlns:ma="http://schemas.microsoft.com/office/2006/metadata/properties/metaAttributes" ct:_="" ma:_="" ma:contentTypeName="Document" ma:contentTypeID="0x0101007DB1CE9637BB0449967D046DBF1D1444" ma:contentTypeVersion="4" ma:contentTypeDescription="Create a new document." ma:contentTypeScope="" ma:versionID="f17ff8c7f7bed9e4deaa9df9ef4ee00c">
   <xsd:schema xmlns:xsd="http://www.w3.org/2001/XMLSchema" xmlns:xs="http://www.w3.org/2001/XMLSchema" xmlns:p="http://schemas.microsoft.com/office/2006/metadata/properties" xmlns:ns2="4a5e4128-2ee3-423b-81cc-020da4cba2ce" targetNamespace="http://schemas.microsoft.com/office/2006/metadata/properties" ma:root="true" ma:fieldsID="2708c32408332ffd70bfbc1ef338372b" ns2:_="">
     <xsd:import namespace="4a5e4128-2ee3-423b-81cc-020da4cba2ce"/>
@@ -16067,15 +16217,11 @@
 </ct:contentTypeSchema>
 </file>
 
-<file path=customXml/itemProps1.xml><?xml version="1.0" encoding="utf-8"?>
-<ds:datastoreItem xmlns:ds="http://schemas.openxmlformats.org/officeDocument/2006/customXml" ds:itemID="{A0E03AE3-1BB3-46FF-9D8D-FF09762ACA7D}">
-  <ds:schemaRefs>
-    <ds:schemaRef ds:uri="http://schemas.microsoft.com/sharepoint/v3/contenttype/forms"/>
-  </ds:schemaRefs>
-</ds:datastoreItem>
+<file path=customXml/item4.xml><?xml version="1.0" encoding="utf-8"?>
+<b:Sources xmlns:b="http://schemas.openxmlformats.org/officeDocument/2006/bibliography" xmlns="http://schemas.openxmlformats.org/officeDocument/2006/bibliography" SelectedStyle="/APA.XSL" StyleName="APA"/>
 </file>
 
-<file path=customXml/itemProps2.xml><?xml version="1.0" encoding="utf-8"?>
+<file path=customXml/itemProps1.xml><?xml version="1.0" encoding="utf-8"?>
 <ds:datastoreItem xmlns:ds="http://schemas.openxmlformats.org/officeDocument/2006/customXml" ds:itemID="{D82F6DFF-C553-4A16-A33B-75A5133FD1CB}">
   <ds:schemaRefs>
     <ds:schemaRef ds:uri="http://schemas.microsoft.com/office/2006/metadata/properties"/>
@@ -16084,15 +16230,15 @@
 </ds:datastoreItem>
 </file>
 
-<file path=customXml/itemProps3.xml><?xml version="1.0" encoding="utf-8"?>
-<ds:datastoreItem xmlns:ds="http://schemas.openxmlformats.org/officeDocument/2006/customXml" ds:itemID="{37FF3F48-C22B-BD46-8510-4191AB26FC19}">
+<file path=customXml/itemProps2.xml><?xml version="1.0" encoding="utf-8"?>
+<ds:datastoreItem xmlns:ds="http://schemas.openxmlformats.org/officeDocument/2006/customXml" ds:itemID="{A0E03AE3-1BB3-46FF-9D8D-FF09762ACA7D}">
   <ds:schemaRefs>
-    <ds:schemaRef ds:uri="http://schemas.openxmlformats.org/officeDocument/2006/bibliography"/>
+    <ds:schemaRef ds:uri="http://schemas.microsoft.com/sharepoint/v3/contenttype/forms"/>
   </ds:schemaRefs>
 </ds:datastoreItem>
 </file>
 
-<file path=customXml/itemProps4.xml><?xml version="1.0" encoding="utf-8"?>
+<file path=customXml/itemProps3.xml><?xml version="1.0" encoding="utf-8"?>
 <ds:datastoreItem xmlns:ds="http://schemas.openxmlformats.org/officeDocument/2006/customXml" ds:itemID="{52BF99EE-258D-4310-B6FC-1641FC4E34BC}">
   <ds:schemaRefs>
     <ds:schemaRef ds:uri="http://schemas.microsoft.com/office/2006/metadata/contentType"/>
@@ -16108,4 +16254,12 @@
     <ds:schemaRef ds:uri="http://schemas.microsoft.com/internal/obd"/>
   </ds:schemaRefs>
 </ds:datastoreItem>
+</file>
+
+<file path=customXml/itemProps4.xml><?xml version="1.0" encoding="utf-8"?>
+<ds:datastoreItem xmlns:ds="http://schemas.openxmlformats.org/officeDocument/2006/customXml" ds:itemID="{37FF3F48-C22B-BD46-8510-4191AB26FC19}">
+  <ds:schemaRefs>
+    <ds:schemaRef ds:uri="http://schemas.openxmlformats.org/officeDocument/2006/bibliography"/>
+  </ds:schemaRefs>
+</ds:datastoreItem>
 </file>
</xml_diff>

<commit_message>
State that Deployment_Information is required in the user guide
Updates the user guide and its source copy, and rebuilds the PDF.

Co-Authored-By: Claude Sonnet 5.5 <noreply@anthropic.com>
</commit_message>
<xml_diff>
--- a/Docs/User Guide/Master_Class_Diagnostics_Workbench_User_Guide.docx
+++ b/Docs/User Guide/Master_Class_Diagnostics_Workbench_User_Guide.docx
@@ -3118,56 +3118,56 @@
       <w:pPr>
         <w:pStyle w:val="Heading2"/>
       </w:pPr>
-      <w:bookmarkStart w:id="2" w:name="_Toc242853464"/>
-      <w:bookmarkStart w:id="3" w:name="_Toc242892775"/>
+      <w:bookmarkStart w:id="2" w:name="_Toc242892775"/>
+      <w:bookmarkStart w:id="3" w:name="_Toc242853464"/>
       <w:r>
         <w:t>1.1 Purpose And Project Status</w:t>
       </w:r>
+      <w:bookmarkEnd w:id="2"/>
+    </w:p>
+    <w:p>
+      <w:r>
+        <w:t>Built for the Master Class, the Workbench is a completed class demonstration, not an application under ongoing active development. It is intended to inspire class members and showcase the possibilities of automation.</w:t>
+      </w:r>
+    </w:p>
+    <w:p>
+      <w:r>
+        <w:t>Class members are encouraged to add their own modules and extend the Workbench. Much of the application was built with AI assistance, and you can continue using AI to develop your own extensions to the framework.</w:t>
+      </w:r>
+    </w:p>
+    <w:p>
+      <w:r>
+        <w:t xml:space="preserve">Class members have read-only access to the GitHub repository, </w:t>
+      </w:r>
+      <w:hyperlink r:id="rId13" w:history="1">
+        <w:r>
+          <w:rPr>
+            <w:rStyle w:val="Hyperlink"/>
+          </w:rPr>
+          <w:t>https://github.com/dmccalla/BigFix-Master-Class-2026</w:t>
+        </w:r>
+      </w:hyperlink>
+      <w:r>
+        <w:t xml:space="preserve">. Make changes in your own copy or fork. Report issues and request enhancements through the repository's </w:t>
+      </w:r>
+      <w:hyperlink r:id="rId14" w:history="1">
+        <w:r>
+          <w:rPr>
+            <w:rStyle w:val="Hyperlink"/>
+          </w:rPr>
+          <w:t>Issues tab</w:t>
+        </w:r>
+      </w:hyperlink>
+      <w:r>
+        <w:t>. Further work on the class version will be considered in response to those requests.</w:t>
+      </w:r>
+    </w:p>
+    <w:p>
+      <w:pPr>
+        <w:pStyle w:val="Heading2"/>
+      </w:pPr>
+      <w:bookmarkStart w:id="4" w:name="_Toc242892776"/>
       <w:bookmarkEnd w:id="3"/>
-    </w:p>
-    <w:p>
-      <w:r>
-        <w:t>Built for the Master Class, the Workbench is a completed class demonstration, not an application under ongoing active development. It is intended to inspire class members and showcase the possibilities of automation.</w:t>
-      </w:r>
-    </w:p>
-    <w:p>
-      <w:r>
-        <w:t>Class members are encouraged to add their own modules and extend the Workbench. Much of the application was built with AI assistance, and you can continue using AI to develop your own extensions to the framework.</w:t>
-      </w:r>
-    </w:p>
-    <w:p>
-      <w:r>
-        <w:t xml:space="preserve">Class members have read-only access to the GitHub repository, </w:t>
-      </w:r>
-      <w:hyperlink r:id="rId13" w:history="1">
-        <w:r>
-          <w:rPr>
-            <w:rStyle w:val="Hyperlink"/>
-          </w:rPr>
-          <w:t>https://github.com/dmccalla/BigFix-Master-Class-2026</w:t>
-        </w:r>
-      </w:hyperlink>
-      <w:r>
-        <w:t xml:space="preserve">. Make changes in your own copy or fork. Report issues and request enhancements through the repository's </w:t>
-      </w:r>
-      <w:hyperlink r:id="rId14" w:history="1">
-        <w:r>
-          <w:rPr>
-            <w:rStyle w:val="Hyperlink"/>
-          </w:rPr>
-          <w:t>Issues tab</w:t>
-        </w:r>
-      </w:hyperlink>
-      <w:r>
-        <w:t>. Further work on the class version will be considered in response to those requests.</w:t>
-      </w:r>
-    </w:p>
-    <w:p>
-      <w:pPr>
-        <w:pStyle w:val="Heading2"/>
-      </w:pPr>
-      <w:bookmarkStart w:id="4" w:name="_Toc242892776"/>
-      <w:bookmarkEnd w:id="2"/>
       <w:r>
         <w:t>1.2 Requirements</w:t>
       </w:r>
@@ -4555,7 +4555,10 @@
               <w:cnfStyle w:val="000000100000" w:firstRow="0" w:lastRow="0" w:firstColumn="0" w:lastColumn="0" w:oddVBand="0" w:evenVBand="0" w:oddHBand="1" w:evenHBand="0" w:firstRowFirstColumn="0" w:firstRowLastColumn="0" w:lastRowFirstColumn="0" w:lastRowLastColumn="0"/>
             </w:pPr>
             <w:r>
-              <w:t>BigFix Master Class -- Collect Deployment Information (2.0): run once on the root server to collect optional configuration context.</w:t>
+              <w:t xml:space="preserve">BigFix Master Class -- Collect Deployment Information (2.0): </w:t>
+            </w:r>
+            <w:r>
+              <w:t>run once on the root server before the Client Performance analysis. The Workbench requires its Deployment_Information folder.</w:t>
             </w:r>
           </w:p>
           <w:p>
@@ -6364,7 +6367,6 @@
               <w:spacing w:before="20" w:after="20"/>
             </w:pPr>
             <w:r>
-              <w:lastRenderedPageBreak/>
               <w:t>Control</w:t>
             </w:r>
           </w:p>
@@ -7202,17 +7204,10 @@
               <w:t>.xlsm</w:t>
             </w:r>
             <w:r>
-              <w:t xml:space="preserve">, and </w:t>
-            </w:r>
-            <w:r>
-              <w:rPr>
-                <w:b/>
-                <w:bCs/>
-              </w:rPr>
-              <w:t>.xls</w:t>
-            </w:r>
-            <w:r>
-              <w:t>. The Advanced export is not supported.</w:t>
+              <w:t xml:space="preserve">, </w:t>
+            </w:r>
+            <w:r>
+              <w:t>and .xls. The Advanced export is not supported. The Deployment_Information folder from the Collect Deployment Information task is also required.</w:t>
             </w:r>
           </w:p>
         </w:tc>
@@ -7296,7 +7291,7 @@
               <w:cnfStyle w:val="000000100000" w:firstRow="0" w:lastRow="0" w:firstColumn="0" w:lastColumn="0" w:oddVBand="0" w:evenVBand="0" w:oddHBand="1" w:evenHBand="0" w:firstRowFirstColumn="0" w:firstRowLastColumn="0" w:lastRowFirstColumn="0" w:lastRowLastColumn="0"/>
             </w:pPr>
             <w:r>
-              <w:t>Deployment_Information folder, Top 10 slowest evaluations, and UDP notifications.</w:t>
+              <w:t>Top 10 slowest evaluations and UDP notifications.</w:t>
             </w:r>
           </w:p>
         </w:tc>
@@ -7321,7 +7316,6 @@
         <w:rPr>
           <w:noProof/>
         </w:rPr>
-        <w:lastRenderedPageBreak/>
         <w:drawing>
           <wp:inline distT="0" distB="0" distL="0" distR="0" wp14:anchorId="169800A0" wp14:editId="605CAC66">
             <wp:extent cx="5852160" cy="4104640"/>
@@ -7932,7 +7926,6 @@
         <w:rPr>
           <w:noProof/>
         </w:rPr>
-        <w:lastRenderedPageBreak/>
         <w:drawing>
           <wp:inline distT="0" distB="0" distL="0" distR="0" wp14:anchorId="5E4EC0AF" wp14:editId="0E42EE8A">
             <wp:extent cx="5852160" cy="4104640"/>
@@ -8386,7 +8379,6 @@
           <w:color w:val="17707F"/>
           <w:spacing w:val="20"/>
         </w:rPr>
-        <w:lastRenderedPageBreak/>
         <w:t>Section 06</w:t>
       </w:r>
     </w:p>
@@ -8955,7 +8947,6 @@
       <w:bookmarkStart w:id="35" w:name="_Toc242853480"/>
       <w:bookmarkStart w:id="36" w:name="_Toc242892792"/>
       <w:r>
-        <w:lastRenderedPageBreak/>
         <w:t>6.1 Output Terms</w:t>
       </w:r>
       <w:bookmarkEnd w:id="35"/>
@@ -9653,7 +9644,6 @@
           <w:color w:val="17707F"/>
           <w:spacing w:val="20"/>
         </w:rPr>
-        <w:lastRenderedPageBreak/>
         <w:t>Section 07</w:t>
       </w:r>
     </w:p>
@@ -10308,7 +10298,6 @@
           <w:color w:val="17707F"/>
           <w:spacing w:val="20"/>
         </w:rPr>
-        <w:lastRenderedPageBreak/>
         <w:t>Section 08</w:t>
       </w:r>
     </w:p>
@@ -16057,12 +16046,6 @@
 </file>
 
 <file path=customXml/item1.xml><?xml version="1.0" encoding="utf-8"?>
-<p:properties xmlns:p="http://schemas.microsoft.com/office/2006/metadata/properties" xmlns:xsi="http://www.w3.org/2001/XMLSchema-instance" xmlns:pc="http://schemas.microsoft.com/office/infopath/2007/PartnerControls">
-  <documentManagement/>
-</p:properties>
-</file>
-
-<file path=customXml/item2.xml><?xml version="1.0" encoding="utf-8"?>
 <?mso-contentType ?>
 <FormTemplates xmlns="http://schemas.microsoft.com/sharepoint/v3/contenttype/forms">
   <Display>DocumentLibraryForm</Display>
@@ -16071,7 +16054,17 @@
 </FormTemplates>
 </file>
 
+<file path=customXml/item2.xml><?xml version="1.0" encoding="utf-8"?>
+<p:properties xmlns:p="http://schemas.microsoft.com/office/2006/metadata/properties" xmlns:xsi="http://www.w3.org/2001/XMLSchema-instance" xmlns:pc="http://schemas.microsoft.com/office/infopath/2007/PartnerControls">
+  <documentManagement/>
+</p:properties>
+</file>
+
 <file path=customXml/item3.xml><?xml version="1.0" encoding="utf-8"?>
+<b:Sources xmlns:b="http://schemas.openxmlformats.org/officeDocument/2006/bibliography" xmlns="http://schemas.openxmlformats.org/officeDocument/2006/bibliography" SelectedStyle="/APA.XSL" StyleName="APA"/>
+</file>
+
+<file path=customXml/item4.xml><?xml version="1.0" encoding="utf-8"?>
 <ct:contentTypeSchema xmlns:ct="http://schemas.microsoft.com/office/2006/metadata/contentType" xmlns:ma="http://schemas.microsoft.com/office/2006/metadata/properties/metaAttributes" ct:_="" ma:_="" ma:contentTypeName="Document" ma:contentTypeID="0x0101007DB1CE9637BB0449967D046DBF1D1444" ma:contentTypeVersion="4" ma:contentTypeDescription="Create a new document." ma:contentTypeScope="" ma:versionID="f17ff8c7f7bed9e4deaa9df9ef4ee00c">
   <xsd:schema xmlns:xsd="http://www.w3.org/2001/XMLSchema" xmlns:xs="http://www.w3.org/2001/XMLSchema" xmlns:p="http://schemas.microsoft.com/office/2006/metadata/properties" xmlns:ns2="4a5e4128-2ee3-423b-81cc-020da4cba2ce" targetNamespace="http://schemas.microsoft.com/office/2006/metadata/properties" ma:root="true" ma:fieldsID="2708c32408332ffd70bfbc1ef338372b" ns2:_="">
     <xsd:import namespace="4a5e4128-2ee3-423b-81cc-020da4cba2ce"/>
@@ -16217,11 +16210,15 @@
 </ct:contentTypeSchema>
 </file>
 
-<file path=customXml/item4.xml><?xml version="1.0" encoding="utf-8"?>
-<b:Sources xmlns:b="http://schemas.openxmlformats.org/officeDocument/2006/bibliography" xmlns="http://schemas.openxmlformats.org/officeDocument/2006/bibliography" SelectedStyle="/APA.XSL" StyleName="APA"/>
+<file path=customXml/itemProps1.xml><?xml version="1.0" encoding="utf-8"?>
+<ds:datastoreItem xmlns:ds="http://schemas.openxmlformats.org/officeDocument/2006/customXml" ds:itemID="{A0E03AE3-1BB3-46FF-9D8D-FF09762ACA7D}">
+  <ds:schemaRefs>
+    <ds:schemaRef ds:uri="http://schemas.microsoft.com/sharepoint/v3/contenttype/forms"/>
+  </ds:schemaRefs>
+</ds:datastoreItem>
 </file>
 
-<file path=customXml/itemProps1.xml><?xml version="1.0" encoding="utf-8"?>
+<file path=customXml/itemProps2.xml><?xml version="1.0" encoding="utf-8"?>
 <ds:datastoreItem xmlns:ds="http://schemas.openxmlformats.org/officeDocument/2006/customXml" ds:itemID="{D82F6DFF-C553-4A16-A33B-75A5133FD1CB}">
   <ds:schemaRefs>
     <ds:schemaRef ds:uri="http://schemas.microsoft.com/office/2006/metadata/properties"/>
@@ -16230,15 +16227,15 @@
 </ds:datastoreItem>
 </file>
 
-<file path=customXml/itemProps2.xml><?xml version="1.0" encoding="utf-8"?>
-<ds:datastoreItem xmlns:ds="http://schemas.openxmlformats.org/officeDocument/2006/customXml" ds:itemID="{A0E03AE3-1BB3-46FF-9D8D-FF09762ACA7D}">
+<file path=customXml/itemProps3.xml><?xml version="1.0" encoding="utf-8"?>
+<ds:datastoreItem xmlns:ds="http://schemas.openxmlformats.org/officeDocument/2006/customXml" ds:itemID="{37FF3F48-C22B-BD46-8510-4191AB26FC19}">
   <ds:schemaRefs>
-    <ds:schemaRef ds:uri="http://schemas.microsoft.com/sharepoint/v3/contenttype/forms"/>
+    <ds:schemaRef ds:uri="http://schemas.openxmlformats.org/officeDocument/2006/bibliography"/>
   </ds:schemaRefs>
 </ds:datastoreItem>
 </file>
 
-<file path=customXml/itemProps3.xml><?xml version="1.0" encoding="utf-8"?>
+<file path=customXml/itemProps4.xml><?xml version="1.0" encoding="utf-8"?>
 <ds:datastoreItem xmlns:ds="http://schemas.openxmlformats.org/officeDocument/2006/customXml" ds:itemID="{52BF99EE-258D-4310-B6FC-1641FC4E34BC}">
   <ds:schemaRefs>
     <ds:schemaRef ds:uri="http://schemas.microsoft.com/office/2006/metadata/contentType"/>
@@ -16254,12 +16251,4 @@
     <ds:schemaRef ds:uri="http://schemas.microsoft.com/internal/obd"/>
   </ds:schemaRefs>
 </ds:datastoreItem>
-</file>
-
-<file path=customXml/itemProps4.xml><?xml version="1.0" encoding="utf-8"?>
-<ds:datastoreItem xmlns:ds="http://schemas.openxmlformats.org/officeDocument/2006/customXml" ds:itemID="{37FF3F48-C22B-BD46-8510-4191AB26FC19}">
-  <ds:schemaRefs>
-    <ds:schemaRef ds:uri="http://schemas.openxmlformats.org/officeDocument/2006/bibliography"/>
-  </ds:schemaRefs>
-</ds:datastoreItem>
 </file>
</xml_diff>

<commit_message>
Say what the collection tasks change in the user guide
Add what the Collect, Perfmon and FillDB tasks do to a server to section 2.5.
Add three handling rules to section 8.5: the five client setting tasks change
BigFix client settings, the Excel workbooks hold customer computer and network
details, and the Collect tasks take credentials as secure parameters. The PDF
is rebuilt.

Co-Authored-By: Claude Sonnet 5.5 <noreply@anthropic.com>
</commit_message>
<xml_diff>
--- a/Docs/User Guide/Master_Class_Diagnostics_Workbench_User_Guide.docx
+++ b/Docs/User Guide/Master_Class_Diagnostics_Workbench_User_Guide.docx
@@ -1117,7 +1117,7 @@
         </w:rPr>
         <w:fldChar w:fldCharType="separate"/>
       </w:r>
-      <w:hyperlink w:anchor="_Toc242892774" w:history="1">
+      <w:hyperlink w:anchor="_Toc243130176" w:history="1">
         <w:r>
           <w:rPr>
             <w:rStyle w:val="Hyperlink"/>
@@ -1140,7 +1140,7 @@
           <w:rPr>
             <w:webHidden/>
           </w:rPr>
-          <w:instrText xml:space="preserve"> PAGEREF _Toc242892774 \h </w:instrText>
+          <w:instrText xml:space="preserve"> PAGEREF _Toc243130176 \h </w:instrText>
         </w:r>
         <w:r>
           <w:rPr>
@@ -1178,7 +1178,7 @@
           <w:szCs w:val="22"/>
         </w:rPr>
       </w:pPr>
-      <w:hyperlink w:anchor="_Toc242892775" w:history="1">
+      <w:hyperlink w:anchor="_Toc243130177" w:history="1">
         <w:r>
           <w:rPr>
             <w:rStyle w:val="Hyperlink"/>
@@ -1201,7 +1201,7 @@
           <w:rPr>
             <w:webHidden/>
           </w:rPr>
-          <w:instrText xml:space="preserve"> PAGEREF _Toc242892775 \h </w:instrText>
+          <w:instrText xml:space="preserve"> PAGEREF _Toc243130177 \h </w:instrText>
         </w:r>
         <w:r>
           <w:rPr>
@@ -1239,7 +1239,7 @@
           <w:szCs w:val="22"/>
         </w:rPr>
       </w:pPr>
-      <w:hyperlink w:anchor="_Toc242892776" w:history="1">
+      <w:hyperlink w:anchor="_Toc243130178" w:history="1">
         <w:r>
           <w:rPr>
             <w:rStyle w:val="Hyperlink"/>
@@ -1262,7 +1262,7 @@
           <w:rPr>
             <w:webHidden/>
           </w:rPr>
-          <w:instrText xml:space="preserve"> PAGEREF _Toc242892776 \h </w:instrText>
+          <w:instrText xml:space="preserve"> PAGEREF _Toc243130178 \h </w:instrText>
         </w:r>
         <w:r>
           <w:rPr>
@@ -1301,7 +1301,7 @@
           <w:szCs w:val="22"/>
         </w:rPr>
       </w:pPr>
-      <w:hyperlink w:anchor="_Toc242892777" w:history="1">
+      <w:hyperlink w:anchor="_Toc243130179" w:history="1">
         <w:r>
           <w:rPr>
             <w:rStyle w:val="Hyperlink"/>
@@ -1324,7 +1324,7 @@
           <w:rPr>
             <w:webHidden/>
           </w:rPr>
-          <w:instrText xml:space="preserve"> PAGEREF _Toc242892777 \h </w:instrText>
+          <w:instrText xml:space="preserve"> PAGEREF _Toc243130179 \h </w:instrText>
         </w:r>
         <w:r>
           <w:rPr>
@@ -1362,7 +1362,7 @@
           <w:szCs w:val="22"/>
         </w:rPr>
       </w:pPr>
-      <w:hyperlink w:anchor="_Toc242892778" w:history="1">
+      <w:hyperlink w:anchor="_Toc243130180" w:history="1">
         <w:r>
           <w:rPr>
             <w:rStyle w:val="Hyperlink"/>
@@ -1385,7 +1385,7 @@
           <w:rPr>
             <w:webHidden/>
           </w:rPr>
-          <w:instrText xml:space="preserve"> PAGEREF _Toc242892778 \h </w:instrText>
+          <w:instrText xml:space="preserve"> PAGEREF _Toc243130180 \h </w:instrText>
         </w:r>
         <w:r>
           <w:rPr>
@@ -1423,7 +1423,7 @@
           <w:szCs w:val="22"/>
         </w:rPr>
       </w:pPr>
-      <w:hyperlink w:anchor="_Toc242892779" w:history="1">
+      <w:hyperlink w:anchor="_Toc243130181" w:history="1">
         <w:r>
           <w:rPr>
             <w:rStyle w:val="Hyperlink"/>
@@ -1446,7 +1446,7 @@
           <w:rPr>
             <w:webHidden/>
           </w:rPr>
-          <w:instrText xml:space="preserve"> PAGEREF _Toc242892779 \h </w:instrText>
+          <w:instrText xml:space="preserve"> PAGEREF _Toc243130181 \h </w:instrText>
         </w:r>
         <w:r>
           <w:rPr>
@@ -1484,7 +1484,7 @@
           <w:szCs w:val="22"/>
         </w:rPr>
       </w:pPr>
-      <w:hyperlink w:anchor="_Toc242892780" w:history="1">
+      <w:hyperlink w:anchor="_Toc243130182" w:history="1">
         <w:r>
           <w:rPr>
             <w:rStyle w:val="Hyperlink"/>
@@ -1507,7 +1507,7 @@
           <w:rPr>
             <w:webHidden/>
           </w:rPr>
-          <w:instrText xml:space="preserve"> PAGEREF _Toc242892780 \h </w:instrText>
+          <w:instrText xml:space="preserve"> PAGEREF _Toc243130182 \h </w:instrText>
         </w:r>
         <w:r>
           <w:rPr>
@@ -1545,7 +1545,7 @@
           <w:szCs w:val="22"/>
         </w:rPr>
       </w:pPr>
-      <w:hyperlink w:anchor="_Toc242892781" w:history="1">
+      <w:hyperlink w:anchor="_Toc243130183" w:history="1">
         <w:r>
           <w:rPr>
             <w:rStyle w:val="Hyperlink"/>
@@ -1568,7 +1568,7 @@
           <w:rPr>
             <w:webHidden/>
           </w:rPr>
-          <w:instrText xml:space="preserve"> PAGEREF _Toc242892781 \h </w:instrText>
+          <w:instrText xml:space="preserve"> PAGEREF _Toc243130183 \h </w:instrText>
         </w:r>
         <w:r>
           <w:rPr>
@@ -1606,7 +1606,7 @@
           <w:szCs w:val="22"/>
         </w:rPr>
       </w:pPr>
-      <w:hyperlink w:anchor="_Toc242892782" w:history="1">
+      <w:hyperlink w:anchor="_Toc243130184" w:history="1">
         <w:r>
           <w:rPr>
             <w:rStyle w:val="Hyperlink"/>
@@ -1629,7 +1629,7 @@
           <w:rPr>
             <w:webHidden/>
           </w:rPr>
-          <w:instrText xml:space="preserve"> PAGEREF _Toc242892782 \h </w:instrText>
+          <w:instrText xml:space="preserve"> PAGEREF _Toc243130184 \h </w:instrText>
         </w:r>
         <w:r>
           <w:rPr>
@@ -1668,7 +1668,7 @@
           <w:szCs w:val="22"/>
         </w:rPr>
       </w:pPr>
-      <w:hyperlink w:anchor="_Toc242892783" w:history="1">
+      <w:hyperlink w:anchor="_Toc243130185" w:history="1">
         <w:r>
           <w:rPr>
             <w:rStyle w:val="Hyperlink"/>
@@ -1691,7 +1691,7 @@
           <w:rPr>
             <w:webHidden/>
           </w:rPr>
-          <w:instrText xml:space="preserve"> PAGEREF _Toc242892783 \h </w:instrText>
+          <w:instrText xml:space="preserve"> PAGEREF _Toc243130185 \h </w:instrText>
         </w:r>
         <w:r>
           <w:rPr>
@@ -1730,7 +1730,7 @@
           <w:szCs w:val="22"/>
         </w:rPr>
       </w:pPr>
-      <w:hyperlink w:anchor="_Toc242892784" w:history="1">
+      <w:hyperlink w:anchor="_Toc243130186" w:history="1">
         <w:r>
           <w:rPr>
             <w:rStyle w:val="Hyperlink"/>
@@ -1753,7 +1753,7 @@
           <w:rPr>
             <w:webHidden/>
           </w:rPr>
-          <w:instrText xml:space="preserve"> PAGEREF _Toc242892784 \h </w:instrText>
+          <w:instrText xml:space="preserve"> PAGEREF _Toc243130186 \h </w:instrText>
         </w:r>
         <w:r>
           <w:rPr>
@@ -1792,7 +1792,7 @@
           <w:szCs w:val="22"/>
         </w:rPr>
       </w:pPr>
-      <w:hyperlink w:anchor="_Toc242892785" w:history="1">
+      <w:hyperlink w:anchor="_Toc243130187" w:history="1">
         <w:r>
           <w:rPr>
             <w:rStyle w:val="Hyperlink"/>
@@ -1815,7 +1815,7 @@
           <w:rPr>
             <w:webHidden/>
           </w:rPr>
-          <w:instrText xml:space="preserve"> PAGEREF _Toc242892785 \h </w:instrText>
+          <w:instrText xml:space="preserve"> PAGEREF _Toc243130187 \h </w:instrText>
         </w:r>
         <w:r>
           <w:rPr>
@@ -1853,7 +1853,7 @@
           <w:szCs w:val="22"/>
         </w:rPr>
       </w:pPr>
-      <w:hyperlink w:anchor="_Toc242892786" w:history="1">
+      <w:hyperlink w:anchor="_Toc243130188" w:history="1">
         <w:r>
           <w:rPr>
             <w:rStyle w:val="Hyperlink"/>
@@ -1876,7 +1876,7 @@
           <w:rPr>
             <w:webHidden/>
           </w:rPr>
-          <w:instrText xml:space="preserve"> PAGEREF _Toc242892786 \h </w:instrText>
+          <w:instrText xml:space="preserve"> PAGEREF _Toc243130188 \h </w:instrText>
         </w:r>
         <w:r>
           <w:rPr>
@@ -1914,7 +1914,7 @@
           <w:szCs w:val="22"/>
         </w:rPr>
       </w:pPr>
-      <w:hyperlink w:anchor="_Toc242892787" w:history="1">
+      <w:hyperlink w:anchor="_Toc243130189" w:history="1">
         <w:r>
           <w:rPr>
             <w:rStyle w:val="Hyperlink"/>
@@ -1937,7 +1937,7 @@
           <w:rPr>
             <w:webHidden/>
           </w:rPr>
-          <w:instrText xml:space="preserve"> PAGEREF _Toc242892787 \h </w:instrText>
+          <w:instrText xml:space="preserve"> PAGEREF _Toc243130189 \h </w:instrText>
         </w:r>
         <w:r>
           <w:rPr>
@@ -1975,7 +1975,7 @@
           <w:szCs w:val="22"/>
         </w:rPr>
       </w:pPr>
-      <w:hyperlink w:anchor="_Toc242892788" w:history="1">
+      <w:hyperlink w:anchor="_Toc243130190" w:history="1">
         <w:r>
           <w:rPr>
             <w:rStyle w:val="Hyperlink"/>
@@ -1998,7 +1998,7 @@
           <w:rPr>
             <w:webHidden/>
           </w:rPr>
-          <w:instrText xml:space="preserve"> PAGEREF _Toc242892788 \h </w:instrText>
+          <w:instrText xml:space="preserve"> PAGEREF _Toc243130190 \h </w:instrText>
         </w:r>
         <w:r>
           <w:rPr>
@@ -2036,7 +2036,7 @@
           <w:szCs w:val="22"/>
         </w:rPr>
       </w:pPr>
-      <w:hyperlink w:anchor="_Toc242892789" w:history="1">
+      <w:hyperlink w:anchor="_Toc243130191" w:history="1">
         <w:r>
           <w:rPr>
             <w:rStyle w:val="Hyperlink"/>
@@ -2059,7 +2059,7 @@
           <w:rPr>
             <w:webHidden/>
           </w:rPr>
-          <w:instrText xml:space="preserve"> PAGEREF _Toc242892789 \h </w:instrText>
+          <w:instrText xml:space="preserve"> PAGEREF _Toc243130191 \h </w:instrText>
         </w:r>
         <w:r>
           <w:rPr>
@@ -2097,7 +2097,7 @@
           <w:szCs w:val="22"/>
         </w:rPr>
       </w:pPr>
-      <w:hyperlink w:anchor="_Toc242892790" w:history="1">
+      <w:hyperlink w:anchor="_Toc243130192" w:history="1">
         <w:r>
           <w:rPr>
             <w:rStyle w:val="Hyperlink"/>
@@ -2120,7 +2120,7 @@
           <w:rPr>
             <w:webHidden/>
           </w:rPr>
-          <w:instrText xml:space="preserve"> PAGEREF _Toc242892790 \h </w:instrText>
+          <w:instrText xml:space="preserve"> PAGEREF _Toc243130192 \h </w:instrText>
         </w:r>
         <w:r>
           <w:rPr>
@@ -2159,7 +2159,7 @@
           <w:szCs w:val="22"/>
         </w:rPr>
       </w:pPr>
-      <w:hyperlink w:anchor="_Toc242892791" w:history="1">
+      <w:hyperlink w:anchor="_Toc243130193" w:history="1">
         <w:r>
           <w:rPr>
             <w:rStyle w:val="Hyperlink"/>
@@ -2182,7 +2182,7 @@
           <w:rPr>
             <w:webHidden/>
           </w:rPr>
-          <w:instrText xml:space="preserve"> PAGEREF _Toc242892791 \h </w:instrText>
+          <w:instrText xml:space="preserve"> PAGEREF _Toc243130193 \h </w:instrText>
         </w:r>
         <w:r>
           <w:rPr>
@@ -2220,7 +2220,7 @@
           <w:szCs w:val="22"/>
         </w:rPr>
       </w:pPr>
-      <w:hyperlink w:anchor="_Toc242892792" w:history="1">
+      <w:hyperlink w:anchor="_Toc243130194" w:history="1">
         <w:r>
           <w:rPr>
             <w:rStyle w:val="Hyperlink"/>
@@ -2243,7 +2243,7 @@
           <w:rPr>
             <w:webHidden/>
           </w:rPr>
-          <w:instrText xml:space="preserve"> PAGEREF _Toc242892792 \h </w:instrText>
+          <w:instrText xml:space="preserve"> PAGEREF _Toc243130194 \h </w:instrText>
         </w:r>
         <w:r>
           <w:rPr>
@@ -2281,7 +2281,7 @@
           <w:szCs w:val="22"/>
         </w:rPr>
       </w:pPr>
-      <w:hyperlink w:anchor="_Toc242892793" w:history="1">
+      <w:hyperlink w:anchor="_Toc243130195" w:history="1">
         <w:r>
           <w:rPr>
             <w:rStyle w:val="Hyperlink"/>
@@ -2304,7 +2304,7 @@
           <w:rPr>
             <w:webHidden/>
           </w:rPr>
-          <w:instrText xml:space="preserve"> PAGEREF _Toc242892793 \h </w:instrText>
+          <w:instrText xml:space="preserve"> PAGEREF _Toc243130195 \h </w:instrText>
         </w:r>
         <w:r>
           <w:rPr>
@@ -2343,7 +2343,7 @@
           <w:szCs w:val="22"/>
         </w:rPr>
       </w:pPr>
-      <w:hyperlink w:anchor="_Toc242892794" w:history="1">
+      <w:hyperlink w:anchor="_Toc243130196" w:history="1">
         <w:r>
           <w:rPr>
             <w:rStyle w:val="Hyperlink"/>
@@ -2366,7 +2366,7 @@
           <w:rPr>
             <w:webHidden/>
           </w:rPr>
-          <w:instrText xml:space="preserve"> PAGEREF _Toc242892794 \h </w:instrText>
+          <w:instrText xml:space="preserve"> PAGEREF _Toc243130196 \h </w:instrText>
         </w:r>
         <w:r>
           <w:rPr>
@@ -2405,7 +2405,7 @@
           <w:szCs w:val="22"/>
         </w:rPr>
       </w:pPr>
-      <w:hyperlink w:anchor="_Toc242892795" w:history="1">
+      <w:hyperlink w:anchor="_Toc243130197" w:history="1">
         <w:r>
           <w:rPr>
             <w:rStyle w:val="Hyperlink"/>
@@ -2428,7 +2428,7 @@
           <w:rPr>
             <w:webHidden/>
           </w:rPr>
-          <w:instrText xml:space="preserve"> PAGEREF _Toc242892795 \h </w:instrText>
+          <w:instrText xml:space="preserve"> PAGEREF _Toc243130197 \h </w:instrText>
         </w:r>
         <w:r>
           <w:rPr>
@@ -2466,7 +2466,7 @@
           <w:szCs w:val="22"/>
         </w:rPr>
       </w:pPr>
-      <w:hyperlink w:anchor="_Toc242892796" w:history="1">
+      <w:hyperlink w:anchor="_Toc243130198" w:history="1">
         <w:r>
           <w:rPr>
             <w:rStyle w:val="Hyperlink"/>
@@ -2489,7 +2489,7 @@
           <w:rPr>
             <w:webHidden/>
           </w:rPr>
-          <w:instrText xml:space="preserve"> PAGEREF _Toc242892796 \h </w:instrText>
+          <w:instrText xml:space="preserve"> PAGEREF _Toc243130198 \h </w:instrText>
         </w:r>
         <w:r>
           <w:rPr>
@@ -2527,7 +2527,7 @@
           <w:szCs w:val="22"/>
         </w:rPr>
       </w:pPr>
-      <w:hyperlink w:anchor="_Toc242892797" w:history="1">
+      <w:hyperlink w:anchor="_Toc243130199" w:history="1">
         <w:r>
           <w:rPr>
             <w:rStyle w:val="Hyperlink"/>
@@ -2550,7 +2550,7 @@
           <w:rPr>
             <w:webHidden/>
           </w:rPr>
-          <w:instrText xml:space="preserve"> PAGEREF _Toc242892797 \h </w:instrText>
+          <w:instrText xml:space="preserve"> PAGEREF _Toc243130199 \h </w:instrText>
         </w:r>
         <w:r>
           <w:rPr>
@@ -2588,7 +2588,7 @@
           <w:szCs w:val="22"/>
         </w:rPr>
       </w:pPr>
-      <w:hyperlink w:anchor="_Toc242892798" w:history="1">
+      <w:hyperlink w:anchor="_Toc243130200" w:history="1">
         <w:r>
           <w:rPr>
             <w:rStyle w:val="Hyperlink"/>
@@ -2611,7 +2611,7 @@
           <w:rPr>
             <w:webHidden/>
           </w:rPr>
-          <w:instrText xml:space="preserve"> PAGEREF _Toc242892798 \h </w:instrText>
+          <w:instrText xml:space="preserve"> PAGEREF _Toc243130200 \h </w:instrText>
         </w:r>
         <w:r>
           <w:rPr>
@@ -2649,7 +2649,7 @@
           <w:szCs w:val="22"/>
         </w:rPr>
       </w:pPr>
-      <w:hyperlink w:anchor="_Toc242892799" w:history="1">
+      <w:hyperlink w:anchor="_Toc243130201" w:history="1">
         <w:r>
           <w:rPr>
             <w:rStyle w:val="Hyperlink"/>
@@ -2672,7 +2672,7 @@
           <w:rPr>
             <w:webHidden/>
           </w:rPr>
-          <w:instrText xml:space="preserve"> PAGEREF _Toc242892799 \h </w:instrText>
+          <w:instrText xml:space="preserve"> PAGEREF _Toc243130201 \h </w:instrText>
         </w:r>
         <w:r>
           <w:rPr>
@@ -2710,7 +2710,7 @@
           <w:szCs w:val="22"/>
         </w:rPr>
       </w:pPr>
-      <w:hyperlink w:anchor="_Toc242892800" w:history="1">
+      <w:hyperlink w:anchor="_Toc243130202" w:history="1">
         <w:r>
           <w:rPr>
             <w:rStyle w:val="Hyperlink"/>
@@ -2733,7 +2733,7 @@
           <w:rPr>
             <w:webHidden/>
           </w:rPr>
-          <w:instrText xml:space="preserve"> PAGEREF _Toc242892800 \h </w:instrText>
+          <w:instrText xml:space="preserve"> PAGEREF _Toc243130202 \h </w:instrText>
         </w:r>
         <w:r>
           <w:rPr>
@@ -2803,7 +2803,7 @@
         <w:ind w:left="720"/>
       </w:pPr>
       <w:bookmarkStart w:id="0" w:name="_Toc242853463"/>
-      <w:bookmarkStart w:id="1" w:name="_Toc242892774"/>
+      <w:bookmarkStart w:id="1" w:name="_Toc243130176"/>
       <w:r>
         <w:rPr>
           <w:noProof/>
@@ -3118,56 +3118,56 @@
       <w:pPr>
         <w:pStyle w:val="Heading2"/>
       </w:pPr>
-      <w:bookmarkStart w:id="2" w:name="_Toc242892775"/>
-      <w:bookmarkStart w:id="3" w:name="_Toc242853464"/>
+      <w:bookmarkStart w:id="2" w:name="_Toc242853464"/>
+      <w:bookmarkStart w:id="3" w:name="_Toc243130177"/>
       <w:r>
         <w:t>1.1 Purpose And Project Status</w:t>
       </w:r>
+      <w:bookmarkEnd w:id="3"/>
+    </w:p>
+    <w:p>
+      <w:r>
+        <w:t>Built for the Master Class, the Workbench is a completed class demonstration, not an application under ongoing active development. It is intended to inspire class members and showcase the possibilities of automation.</w:t>
+      </w:r>
+    </w:p>
+    <w:p>
+      <w:r>
+        <w:t>Class members are encouraged to add their own modules and extend the Workbench. Much of the application was built with AI assistance, and you can continue using AI to develop your own extensions to the framework.</w:t>
+      </w:r>
+    </w:p>
+    <w:p>
+      <w:r>
+        <w:t xml:space="preserve">Class members have read-only access to the GitHub repository, </w:t>
+      </w:r>
+      <w:hyperlink r:id="rId13" w:history="1">
+        <w:r>
+          <w:rPr>
+            <w:rStyle w:val="Hyperlink"/>
+          </w:rPr>
+          <w:t>https://github.com/dmccalla/BigFix-Master-Class-2026</w:t>
+        </w:r>
+      </w:hyperlink>
+      <w:r>
+        <w:t xml:space="preserve">. Make changes in your own copy or fork. Report issues and request enhancements through the repository's </w:t>
+      </w:r>
+      <w:hyperlink r:id="rId14" w:history="1">
+        <w:r>
+          <w:rPr>
+            <w:rStyle w:val="Hyperlink"/>
+          </w:rPr>
+          <w:t>Issues tab</w:t>
+        </w:r>
+      </w:hyperlink>
+      <w:r>
+        <w:t>. Further work on the class version will be considered in response to those requests.</w:t>
+      </w:r>
+    </w:p>
+    <w:p>
+      <w:pPr>
+        <w:pStyle w:val="Heading2"/>
+      </w:pPr>
+      <w:bookmarkStart w:id="4" w:name="_Toc243130178"/>
       <w:bookmarkEnd w:id="2"/>
-    </w:p>
-    <w:p>
-      <w:r>
-        <w:t>Built for the Master Class, the Workbench is a completed class demonstration, not an application under ongoing active development. It is intended to inspire class members and showcase the possibilities of automation.</w:t>
-      </w:r>
-    </w:p>
-    <w:p>
-      <w:r>
-        <w:t>Class members are encouraged to add their own modules and extend the Workbench. Much of the application was built with AI assistance, and you can continue using AI to develop your own extensions to the framework.</w:t>
-      </w:r>
-    </w:p>
-    <w:p>
-      <w:r>
-        <w:t xml:space="preserve">Class members have read-only access to the GitHub repository, </w:t>
-      </w:r>
-      <w:hyperlink r:id="rId13" w:history="1">
-        <w:r>
-          <w:rPr>
-            <w:rStyle w:val="Hyperlink"/>
-          </w:rPr>
-          <w:t>https://github.com/dmccalla/BigFix-Master-Class-2026</w:t>
-        </w:r>
-      </w:hyperlink>
-      <w:r>
-        <w:t xml:space="preserve">. Make changes in your own copy or fork. Report issues and request enhancements through the repository's </w:t>
-      </w:r>
-      <w:hyperlink r:id="rId14" w:history="1">
-        <w:r>
-          <w:rPr>
-            <w:rStyle w:val="Hyperlink"/>
-          </w:rPr>
-          <w:t>Issues tab</w:t>
-        </w:r>
-      </w:hyperlink>
-      <w:r>
-        <w:t>. Further work on the class version will be considered in response to those requests.</w:t>
-      </w:r>
-    </w:p>
-    <w:p>
-      <w:pPr>
-        <w:pStyle w:val="Heading2"/>
-      </w:pPr>
-      <w:bookmarkStart w:id="4" w:name="_Toc242892776"/>
-      <w:bookmarkEnd w:id="3"/>
       <w:r>
         <w:t>1.2 Requirements</w:t>
       </w:r>
@@ -3565,7 +3565,7 @@
         <w:ind w:left="720"/>
       </w:pPr>
       <w:bookmarkStart w:id="5" w:name="_Toc242853465"/>
-      <w:bookmarkStart w:id="6" w:name="_Toc242892777"/>
+      <w:bookmarkStart w:id="6" w:name="_Toc243130179"/>
       <w:r>
         <w:rPr>
           <w:noProof/>
@@ -3716,7 +3716,7 @@
         <w:pStyle w:val="Heading2"/>
       </w:pPr>
       <w:bookmarkStart w:id="7" w:name="_Toc242853466"/>
-      <w:bookmarkStart w:id="8" w:name="_Toc242892778"/>
+      <w:bookmarkStart w:id="8" w:name="_Toc243130180"/>
       <w:r>
         <w:t>2.1 Install Python</w:t>
       </w:r>
@@ -3833,7 +3833,7 @@
         <w:pStyle w:val="Heading2"/>
       </w:pPr>
       <w:bookmarkStart w:id="9" w:name="_Toc242853467"/>
-      <w:bookmarkStart w:id="10" w:name="_Toc242892779"/>
+      <w:bookmarkStart w:id="10" w:name="_Toc243130181"/>
       <w:r>
         <w:t>2.2 Install uv</w:t>
       </w:r>
@@ -3868,7 +3868,7 @@
         <w:pStyle w:val="Heading2"/>
       </w:pPr>
       <w:bookmarkStart w:id="11" w:name="_Toc242853468"/>
-      <w:bookmarkStart w:id="12" w:name="_Toc242892780"/>
+      <w:bookmarkStart w:id="12" w:name="_Toc243130182"/>
       <w:r>
         <w:t>2.3 Launch The Workbench</w:t>
       </w:r>
@@ -4241,7 +4241,7 @@
         <w:pStyle w:val="Heading2"/>
       </w:pPr>
       <w:bookmarkStart w:id="13" w:name="_Toc242853469"/>
-      <w:bookmarkStart w:id="14" w:name="_Toc242892781"/>
+      <w:bookmarkStart w:id="14" w:name="_Toc243130183"/>
       <w:r>
         <w:lastRenderedPageBreak/>
         <w:t>2.4 If Setup Fails</w:t>
@@ -4448,7 +4448,7 @@
         <w:pStyle w:val="Heading2"/>
       </w:pPr>
       <w:bookmarkStart w:id="15" w:name="_Toc242853470"/>
-      <w:bookmarkStart w:id="16" w:name="_Toc242892782"/>
+      <w:bookmarkStart w:id="16" w:name="_Toc243130184"/>
       <w:r>
         <w:t>2.5 Collect The Data</w:t>
       </w:r>
@@ -4691,6 +4691,21 @@
       </w:r>
     </w:p>
     <w:p>
+      <w:r>
+        <w:t>The Collect tasks run only after a Master Operator takes the action. They read from the root server through the REST API and contact no other server. They write to BigFix_Master_Class\Platform\Results on the drive that holds the BigFix client. They back up earlier results first and change no BigFix setting.</w:t>
+      </w:r>
+    </w:p>
+    <w:p>
+      <w:r>
+        <w:t>The Perfmon task creates a data collector set named BFPerf that stays defined after the capture. To remove it run logman stop BFPerf and logman delete BFPerf.</w:t>
+      </w:r>
+    </w:p>
+    <w:p>
+      <w:r>
+        <w:t>The FillDB task turns on FillDB performance logging in the registry and restarts the FillDB service. The generated disable action restores the original setting. If it does not run, run WARNING: BigFix Master Class -- FillDB Performance Logging is Enabled (2.0).</w:t>
+      </w:r>
+    </w:p>
+    <w:p>
       <w:pPr>
         <w:keepNext/>
         <w:pageBreakBefore/>
@@ -4723,7 +4738,7 @@
         <w:ind w:left="720"/>
       </w:pPr>
       <w:bookmarkStart w:id="17" w:name="_Toc242853471"/>
-      <w:bookmarkStart w:id="18" w:name="_Toc242892783"/>
+      <w:bookmarkStart w:id="18" w:name="_Toc243130185"/>
       <w:r>
         <w:rPr>
           <w:noProof/>
@@ -5036,7 +5051,7 @@
         <w:ind w:left="720"/>
       </w:pPr>
       <w:bookmarkStart w:id="19" w:name="_Toc242853472"/>
-      <w:bookmarkStart w:id="20" w:name="_Toc242892784"/>
+      <w:bookmarkStart w:id="20" w:name="_Toc243130186"/>
       <w:r>
         <w:rPr>
           <w:noProof/>
@@ -5791,7 +5806,7 @@
         <w:ind w:left="720"/>
       </w:pPr>
       <w:bookmarkStart w:id="21" w:name="_Toc242853473"/>
-      <w:bookmarkStart w:id="22" w:name="_Toc242892785"/>
+      <w:bookmarkStart w:id="22" w:name="_Toc243130187"/>
       <w:r>
         <w:rPr>
           <w:noProof/>
@@ -6094,7 +6109,7 @@
         <w:pStyle w:val="Heading2"/>
       </w:pPr>
       <w:bookmarkStart w:id="23" w:name="_Toc242853474"/>
-      <w:bookmarkStart w:id="24" w:name="_Toc242892786"/>
+      <w:bookmarkStart w:id="24" w:name="_Toc243130188"/>
       <w:r>
         <w:t>5.1 Select Modules</w:t>
       </w:r>
@@ -6367,6 +6382,7 @@
               <w:spacing w:before="20" w:after="20"/>
             </w:pPr>
             <w:r>
+              <w:lastRenderedPageBreak/>
               <w:t>Control</w:t>
             </w:r>
           </w:p>
@@ -6680,7 +6696,7 @@
         <w:pStyle w:val="Heading2"/>
       </w:pPr>
       <w:bookmarkStart w:id="25" w:name="_Toc242853475"/>
-      <w:bookmarkStart w:id="26" w:name="_Toc242892787"/>
+      <w:bookmarkStart w:id="26" w:name="_Toc243130189"/>
       <w:r>
         <w:t>5.2 Statuses</w:t>
       </w:r>
@@ -7072,7 +7088,7 @@
         <w:pStyle w:val="Heading2"/>
       </w:pPr>
       <w:bookmarkStart w:id="27" w:name="_Toc242853476"/>
-      <w:bookmarkStart w:id="28" w:name="_Toc242892788"/>
+      <w:bookmarkStart w:id="28" w:name="_Toc243130190"/>
       <w:r>
         <w:t>5.3 Client Performance Analysis</w:t>
       </w:r>
@@ -7316,6 +7332,7 @@
         <w:rPr>
           <w:noProof/>
         </w:rPr>
+        <w:lastRenderedPageBreak/>
         <w:drawing>
           <wp:inline distT="0" distB="0" distL="0" distR="0" wp14:anchorId="169800A0" wp14:editId="605CAC66">
             <wp:extent cx="5852160" cy="4104640"/>
@@ -7440,7 +7457,7 @@
         <w:pStyle w:val="Heading2"/>
       </w:pPr>
       <w:bookmarkStart w:id="29" w:name="_Toc242853477"/>
-      <w:bookmarkStart w:id="30" w:name="_Toc242892789"/>
+      <w:bookmarkStart w:id="30" w:name="_Toc243130191"/>
       <w:r>
         <w:t>5.4 Perfmon Infrastructure Analysis</w:t>
       </w:r>
@@ -7926,6 +7943,7 @@
         <w:rPr>
           <w:noProof/>
         </w:rPr>
+        <w:lastRenderedPageBreak/>
         <w:drawing>
           <wp:inline distT="0" distB="0" distL="0" distR="0" wp14:anchorId="5E4EC0AF" wp14:editId="0E42EE8A">
             <wp:extent cx="5852160" cy="4104640"/>
@@ -8129,7 +8147,7 @@
         <w:pStyle w:val="Heading2"/>
       </w:pPr>
       <w:bookmarkStart w:id="31" w:name="_Toc242853478"/>
-      <w:bookmarkStart w:id="32" w:name="_Toc242892790"/>
+      <w:bookmarkStart w:id="32" w:name="_Toc243130192"/>
       <w:r>
         <w:t>5.5 FillDB Performance Analysis</w:t>
       </w:r>
@@ -8379,6 +8397,7 @@
           <w:color w:val="17707F"/>
           <w:spacing w:val="20"/>
         </w:rPr>
+        <w:lastRenderedPageBreak/>
         <w:t>Section 06</w:t>
       </w:r>
     </w:p>
@@ -8388,7 +8407,7 @@
         <w:ind w:left="720"/>
       </w:pPr>
       <w:bookmarkStart w:id="33" w:name="_Toc242853479"/>
-      <w:bookmarkStart w:id="34" w:name="_Toc242892791"/>
+      <w:bookmarkStart w:id="34" w:name="_Toc243130193"/>
       <w:r>
         <w:rPr>
           <w:noProof/>
@@ -8945,8 +8964,9 @@
         <w:pStyle w:val="Heading2"/>
       </w:pPr>
       <w:bookmarkStart w:id="35" w:name="_Toc242853480"/>
-      <w:bookmarkStart w:id="36" w:name="_Toc242892792"/>
-      <w:r>
+      <w:bookmarkStart w:id="36" w:name="_Toc243130194"/>
+      <w:r>
+        <w:lastRenderedPageBreak/>
         <w:t>6.1 Output Terms</w:t>
       </w:r>
       <w:bookmarkEnd w:id="35"/>
@@ -9171,7 +9191,7 @@
         <w:pStyle w:val="Heading2"/>
       </w:pPr>
       <w:bookmarkStart w:id="37" w:name="_Toc242853481"/>
-      <w:bookmarkStart w:id="38" w:name="_Toc242892793"/>
+      <w:bookmarkStart w:id="38" w:name="_Toc243130195"/>
       <w:r>
         <w:t>6.2 The Run Folder</w:t>
       </w:r>
@@ -9644,6 +9664,7 @@
           <w:color w:val="17707F"/>
           <w:spacing w:val="20"/>
         </w:rPr>
+        <w:lastRenderedPageBreak/>
         <w:t>Section 07</w:t>
       </w:r>
     </w:p>
@@ -9653,7 +9674,7 @@
         <w:ind w:left="720"/>
       </w:pPr>
       <w:bookmarkStart w:id="39" w:name="_Toc242853482"/>
-      <w:bookmarkStart w:id="40" w:name="_Toc242892794"/>
+      <w:bookmarkStart w:id="40" w:name="_Toc243130196"/>
       <w:r>
         <w:rPr>
           <w:noProof/>
@@ -10298,6 +10319,7 @@
           <w:color w:val="17707F"/>
           <w:spacing w:val="20"/>
         </w:rPr>
+        <w:lastRenderedPageBreak/>
         <w:t>Section 08</w:t>
       </w:r>
     </w:p>
@@ -10307,7 +10329,7 @@
         <w:ind w:left="720"/>
       </w:pPr>
       <w:bookmarkStart w:id="41" w:name="_Toc242853483"/>
-      <w:bookmarkStart w:id="42" w:name="_Toc242892795"/>
+      <w:bookmarkStart w:id="42" w:name="_Toc243130197"/>
       <w:r>
         <w:rPr>
           <w:noProof/>
@@ -10453,7 +10475,7 @@
         <w:pStyle w:val="Heading2"/>
       </w:pPr>
       <w:bookmarkStart w:id="43" w:name="_Toc242853484"/>
-      <w:bookmarkStart w:id="44" w:name="_Toc242892796"/>
+      <w:bookmarkStart w:id="44" w:name="_Toc243130198"/>
       <w:r>
         <w:t>8.1 Air-Gapped Analysis</w:t>
       </w:r>
@@ -10470,7 +10492,7 @@
         <w:pStyle w:val="Heading2"/>
       </w:pPr>
       <w:bookmarkStart w:id="45" w:name="_Toc242853485"/>
-      <w:bookmarkStart w:id="46" w:name="_Toc242892797"/>
+      <w:bookmarkStart w:id="46" w:name="_Toc243130199"/>
       <w:r>
         <w:t>8.2 The Private Python Environment</w:t>
       </w:r>
@@ -10492,7 +10514,7 @@
         <w:pStyle w:val="Heading2"/>
       </w:pPr>
       <w:bookmarkStart w:id="47" w:name="_Toc242853486"/>
-      <w:bookmarkStart w:id="48" w:name="_Toc242892798"/>
+      <w:bookmarkStart w:id="48" w:name="_Toc243130200"/>
       <w:r>
         <w:t>8.3 Dependency Cooldowns</w:t>
       </w:r>
@@ -10509,7 +10531,7 @@
         <w:pStyle w:val="Heading2"/>
       </w:pPr>
       <w:bookmarkStart w:id="49" w:name="_Toc242853487"/>
-      <w:bookmarkStart w:id="50" w:name="_Toc242892799"/>
+      <w:bookmarkStart w:id="50" w:name="_Toc243130201"/>
       <w:r>
         <w:t>8.4 Code Sweeps</w:t>
       </w:r>
@@ -10531,7 +10553,7 @@
         <w:pStyle w:val="Heading2"/>
       </w:pPr>
       <w:bookmarkStart w:id="51" w:name="_Toc242853488"/>
-      <w:bookmarkStart w:id="52" w:name="_Toc242892800"/>
+      <w:bookmarkStart w:id="52" w:name="_Toc243130202"/>
       <w:r>
         <w:t>8.5 Data Handling Rules</w:t>
       </w:r>
@@ -10580,6 +10602,48 @@
       </w:pPr>
       <w:r>
         <w:t>Review collected files and generated outputs before you share them.</w:t>
+      </w:r>
+    </w:p>
+    <w:p>
+      <w:pPr>
+        <w:pStyle w:val="ListParagraph"/>
+        <w:numPr>
+          <w:ilvl w:val="0"/>
+          <w:numId w:val="14"/>
+        </w:numPr>
+        <w:spacing w:before="50" w:after="50"/>
+        <w:contextualSpacing w:val="0"/>
+      </w:pPr>
+      <w:r>
+        <w:t>Five tasks change BigFix client settings on the computers they target: Enable Client CPU Multicore Scaling, Enable Client FastHashVerify Setting, Set CPU Utilization to 2% on Windows Multi-Core Systems, Set CPU Utilization to 20%, and Set Command Polling to 10 Minutes over Average Evaluation Time. A setting stays in place until it is changed again. No task that resets these settings is supplied.</w:t>
+      </w:r>
+    </w:p>
+    <w:p>
+      <w:pPr>
+        <w:pStyle w:val="ListParagraph"/>
+        <w:numPr>
+          <w:ilvl w:val="0"/>
+          <w:numId w:val="14"/>
+        </w:numPr>
+        <w:spacing w:before="50" w:after="50"/>
+        <w:contextualSpacing w:val="0"/>
+      </w:pPr>
+      <w:r>
+        <w:t>The Excel workbooks list individual computers and network details such as relay names and subnets. Share them only with the customer whose deployment they describe.</w:t>
+      </w:r>
+    </w:p>
+    <w:p>
+      <w:pPr>
+        <w:pStyle w:val="ListParagraph"/>
+        <w:numPr>
+          <w:ilvl w:val="0"/>
+          <w:numId w:val="14"/>
+        </w:numPr>
+        <w:spacing w:before="50" w:after="50"/>
+        <w:contextualSpacing w:val="0"/>
+      </w:pPr>
+      <w:r>
+        <w:t>The Collect tasks take the console user name and password as BigFix secure parameters. Use a dedicated Master Operator account for the collection and change its password afterward.</w:t>
       </w:r>
     </w:p>
     <w:sectPr>
@@ -13943,7 +14007,6 @@
   <w:style w:type="character" w:default="1" w:styleId="DefaultParagraphFont">
     <w:name w:val="Default Paragraph Font"/>
     <w:uiPriority w:val="1"/>
-    <w:semiHidden/>
     <w:unhideWhenUsed/>
   </w:style>
   <w:style w:type="table" w:default="1" w:styleId="TableNormal">
@@ -16046,6 +16109,12 @@
 </file>
 
 <file path=customXml/item1.xml><?xml version="1.0" encoding="utf-8"?>
+<p:properties xmlns:p="http://schemas.microsoft.com/office/2006/metadata/properties" xmlns:xsi="http://www.w3.org/2001/XMLSchema-instance" xmlns:pc="http://schemas.microsoft.com/office/infopath/2007/PartnerControls">
+  <documentManagement/>
+</p:properties>
+</file>
+
+<file path=customXml/item2.xml><?xml version="1.0" encoding="utf-8"?>
 <?mso-contentType ?>
 <FormTemplates xmlns="http://schemas.microsoft.com/sharepoint/v3/contenttype/forms">
   <Display>DocumentLibraryForm</Display>
@@ -16054,17 +16123,7 @@
 </FormTemplates>
 </file>
 
-<file path=customXml/item2.xml><?xml version="1.0" encoding="utf-8"?>
-<p:properties xmlns:p="http://schemas.microsoft.com/office/2006/metadata/properties" xmlns:xsi="http://www.w3.org/2001/XMLSchema-instance" xmlns:pc="http://schemas.microsoft.com/office/infopath/2007/PartnerControls">
-  <documentManagement/>
-</p:properties>
-</file>
-
 <file path=customXml/item3.xml><?xml version="1.0" encoding="utf-8"?>
-<b:Sources xmlns:b="http://schemas.openxmlformats.org/officeDocument/2006/bibliography" xmlns="http://schemas.openxmlformats.org/officeDocument/2006/bibliography" SelectedStyle="/APA.XSL" StyleName="APA"/>
-</file>
-
-<file path=customXml/item4.xml><?xml version="1.0" encoding="utf-8"?>
 <ct:contentTypeSchema xmlns:ct="http://schemas.microsoft.com/office/2006/metadata/contentType" xmlns:ma="http://schemas.microsoft.com/office/2006/metadata/properties/metaAttributes" ct:_="" ma:_="" ma:contentTypeName="Document" ma:contentTypeID="0x0101007DB1CE9637BB0449967D046DBF1D1444" ma:contentTypeVersion="4" ma:contentTypeDescription="Create a new document." ma:contentTypeScope="" ma:versionID="f17ff8c7f7bed9e4deaa9df9ef4ee00c">
   <xsd:schema xmlns:xsd="http://www.w3.org/2001/XMLSchema" xmlns:xs="http://www.w3.org/2001/XMLSchema" xmlns:p="http://schemas.microsoft.com/office/2006/metadata/properties" xmlns:ns2="4a5e4128-2ee3-423b-81cc-020da4cba2ce" targetNamespace="http://schemas.microsoft.com/office/2006/metadata/properties" ma:root="true" ma:fieldsID="2708c32408332ffd70bfbc1ef338372b" ns2:_="">
     <xsd:import namespace="4a5e4128-2ee3-423b-81cc-020da4cba2ce"/>
@@ -16210,15 +16269,11 @@
 </ct:contentTypeSchema>
 </file>
 
-<file path=customXml/itemProps1.xml><?xml version="1.0" encoding="utf-8"?>
-<ds:datastoreItem xmlns:ds="http://schemas.openxmlformats.org/officeDocument/2006/customXml" ds:itemID="{A0E03AE3-1BB3-46FF-9D8D-FF09762ACA7D}">
-  <ds:schemaRefs>
-    <ds:schemaRef ds:uri="http://schemas.microsoft.com/sharepoint/v3/contenttype/forms"/>
-  </ds:schemaRefs>
-</ds:datastoreItem>
+<file path=customXml/item4.xml><?xml version="1.0" encoding="utf-8"?>
+<b:Sources xmlns:b="http://schemas.openxmlformats.org/officeDocument/2006/bibliography" xmlns="http://schemas.openxmlformats.org/officeDocument/2006/bibliography" SelectedStyle="/APA.XSL" StyleName="APA"/>
 </file>
 
-<file path=customXml/itemProps2.xml><?xml version="1.0" encoding="utf-8"?>
+<file path=customXml/itemProps1.xml><?xml version="1.0" encoding="utf-8"?>
 <ds:datastoreItem xmlns:ds="http://schemas.openxmlformats.org/officeDocument/2006/customXml" ds:itemID="{D82F6DFF-C553-4A16-A33B-75A5133FD1CB}">
   <ds:schemaRefs>
     <ds:schemaRef ds:uri="http://schemas.microsoft.com/office/2006/metadata/properties"/>
@@ -16227,15 +16282,15 @@
 </ds:datastoreItem>
 </file>
 
-<file path=customXml/itemProps3.xml><?xml version="1.0" encoding="utf-8"?>
-<ds:datastoreItem xmlns:ds="http://schemas.openxmlformats.org/officeDocument/2006/customXml" ds:itemID="{37FF3F48-C22B-BD46-8510-4191AB26FC19}">
+<file path=customXml/itemProps2.xml><?xml version="1.0" encoding="utf-8"?>
+<ds:datastoreItem xmlns:ds="http://schemas.openxmlformats.org/officeDocument/2006/customXml" ds:itemID="{A0E03AE3-1BB3-46FF-9D8D-FF09762ACA7D}">
   <ds:schemaRefs>
-    <ds:schemaRef ds:uri="http://schemas.openxmlformats.org/officeDocument/2006/bibliography"/>
+    <ds:schemaRef ds:uri="http://schemas.microsoft.com/sharepoint/v3/contenttype/forms"/>
   </ds:schemaRefs>
 </ds:datastoreItem>
 </file>
 
-<file path=customXml/itemProps4.xml><?xml version="1.0" encoding="utf-8"?>
+<file path=customXml/itemProps3.xml><?xml version="1.0" encoding="utf-8"?>
 <ds:datastoreItem xmlns:ds="http://schemas.openxmlformats.org/officeDocument/2006/customXml" ds:itemID="{52BF99EE-258D-4310-B6FC-1641FC4E34BC}">
   <ds:schemaRefs>
     <ds:schemaRef ds:uri="http://schemas.microsoft.com/office/2006/metadata/contentType"/>
@@ -16251,4 +16306,12 @@
     <ds:schemaRef ds:uri="http://schemas.microsoft.com/internal/obd"/>
   </ds:schemaRefs>
 </ds:datastoreItem>
+</file>
+
+<file path=customXml/itemProps4.xml><?xml version="1.0" encoding="utf-8"?>
+<ds:datastoreItem xmlns:ds="http://schemas.openxmlformats.org/officeDocument/2006/customXml" ds:itemID="{37FF3F48-C22B-BD46-8510-4191AB26FC19}">
+  <ds:schemaRefs>
+    <ds:schemaRef ds:uri="http://schemas.openxmlformats.org/officeDocument/2006/bibliography"/>
+  </ds:schemaRefs>
+</ds:datastoreItem>
 </file>
</xml_diff>